<commit_message>
Done Binary Search Algorithm
</commit_message>
<xml_diff>
--- a/DSA_lab/sem_4_DSA_lab/lab_02/lab_02.docx
+++ b/DSA_lab/sem_4_DSA_lab/lab_02/lab_02.docx
@@ -28,7 +28,7 @@
           <w:sz w:val="28"/>
           <w:szCs w:val="28"/>
         </w:rPr>
-        <w:t>1</w:t>
+        <w:t>2</w:t>
       </w:r>
     </w:p>
     <w:p>
@@ -59,7 +59,7 @@
           <w:sz w:val="28"/>
           <w:szCs w:val="28"/>
         </w:rPr>
-        <w:t>Introduction to Pointers and Arrays</w:t>
+        <w:t xml:space="preserve">Linear Search and Binary Search </w:t>
       </w:r>
     </w:p>
     <w:p>
@@ -229,7 +229,16 @@
           <w:sz w:val="28"/>
           <w:szCs w:val="28"/>
         </w:rPr>
-        <w:t>CSE-204L Operating Systems Lab</w:t>
+        <w:t xml:space="preserve">Data Structures and Algorithms </w:t>
+      </w:r>
+      <w:r>
+        <w:rPr>
+          <w:rFonts w:ascii="Times New Roman" w:hAnsi="Times New Roman" w:cs="Times New Roman"/>
+          <w:b/>
+          <w:sz w:val="28"/>
+          <w:szCs w:val="28"/>
+        </w:rPr>
+        <w:t>Lab</w:t>
       </w:r>
     </w:p>
     <w:p>
@@ -404,7 +413,7 @@
           <w:sz w:val="26"/>
           <w:szCs w:val="26"/>
         </w:rPr>
-        <w:t>June</w:t>
+        <w:t xml:space="preserve">June </w:t>
       </w:r>
       <w:r>
         <w:rPr>
@@ -412,15 +421,24 @@
           <w:sz w:val="26"/>
           <w:szCs w:val="26"/>
         </w:rPr>
-        <w:t xml:space="preserve"> </w:t>
+        <w:t>3</w:t>
       </w:r>
       <w:r>
         <w:rPr>
           <w:rFonts w:ascii="Times New Roman" w:hAnsi="Times New Roman" w:cs="Times New Roman"/>
           <w:sz w:val="26"/>
           <w:szCs w:val="26"/>
-        </w:rPr>
-        <w:t>2nd</w:t>
+          <w:vertAlign w:val="superscript"/>
+        </w:rPr>
+        <w:t>rd</w:t>
+      </w:r>
+      <w:r>
+        <w:rPr>
+          <w:rFonts w:ascii="Times New Roman" w:hAnsi="Times New Roman" w:cs="Times New Roman"/>
+          <w:sz w:val="26"/>
+          <w:szCs w:val="26"/>
+        </w:rPr>
+        <w:t xml:space="preserve"> </w:t>
       </w:r>
       <w:r>
         <w:rPr>
@@ -492,14 +510,27 @@
     <w:p/>
     <w:p/>
     <w:p>
-      <w:proofErr w:type="gramStart"/>
       <w:r>
         <w:lastRenderedPageBreak/>
-        <w:t>Task  01</w:t>
+        <w:t>Task  01:</w:t>
       </w:r>
-      <w:proofErr w:type="gramEnd"/>
       <w:r>
-        <w:t xml:space="preserve">:  </w:t>
+        <w:rPr>
+          <w:rFonts w:ascii="Times New Roman" w:hAnsi="Times New Roman" w:cs="Times New Roman"/>
+          <w:bCs/>
+          <w:sz w:val="22"/>
+          <w:szCs w:val="22"/>
+        </w:rPr>
+        <w:t xml:space="preserve">  </w:t>
+      </w:r>
+      <w:r>
+        <w:rPr>
+          <w:rFonts w:ascii="Times New Roman" w:hAnsi="Times New Roman" w:cs="Times New Roman"/>
+          <w:bCs/>
+          <w:sz w:val="22"/>
+          <w:szCs w:val="22"/>
+        </w:rPr>
+        <w:t>Implementation of Linear Search in Arrays:</w:t>
       </w:r>
     </w:p>
     <w:p>
@@ -512,26 +543,17 @@
         </w:rPr>
       </w:pPr>
       <w:r>
+        <w:rPr>
+          <w:rFonts w:ascii="Times New Roman" w:hAnsi="Times New Roman" w:cs="Times New Roman"/>
+          <w:bCs/>
+          <w:noProof/>
+          <w:sz w:val="22"/>
+          <w:szCs w:val="22"/>
+        </w:rPr>
         <w:drawing>
-          <wp:anchor distT="0" distB="0" distL="114300" distR="114300" simplePos="0" relativeHeight="251658240" behindDoc="1" locked="0" layoutInCell="1" allowOverlap="1" wp14:anchorId="04D49893" wp14:editId="39B7EC6F">
-            <wp:simplePos x="0" y="0"/>
-            <wp:positionH relativeFrom="margin">
-              <wp:align>center</wp:align>
-            </wp:positionH>
-            <wp:positionV relativeFrom="paragraph">
-              <wp:posOffset>425450</wp:posOffset>
-            </wp:positionV>
-            <wp:extent cx="5943600" cy="5578475"/>
+          <wp:inline distT="0" distB="0" distL="0" distR="0" wp14:anchorId="46C95CDE" wp14:editId="3EB11184">
+            <wp:extent cx="6858000" cy="4111625"/>
             <wp:effectExtent l="0" t="0" r="0" b="3175"/>
-            <wp:wrapTight wrapText="bothSides">
-              <wp:wrapPolygon edited="0">
-                <wp:start x="0" y="0"/>
-                <wp:lineTo x="0" y="21539"/>
-                <wp:lineTo x="21531" y="21539"/>
-                <wp:lineTo x="21531" y="0"/>
-                <wp:lineTo x="0" y="0"/>
-              </wp:wrapPolygon>
-            </wp:wrapTight>
             <wp:docPr id="1" name="Picture 1"/>
             <wp:cNvGraphicFramePr>
               <a:graphicFrameLocks xmlns:a="http://schemas.openxmlformats.org/drawingml/2006/main" noChangeAspect="1"/>
@@ -544,13 +566,7 @@
                     <pic:cNvPicPr/>
                   </pic:nvPicPr>
                   <pic:blipFill>
-                    <a:blip r:embed="rId5">
-                      <a:extLst>
-                        <a:ext uri="{28A0092B-C50C-407E-A947-70E740481C1C}">
-                          <a14:useLocalDpi xmlns:a14="http://schemas.microsoft.com/office/drawing/2010/main" val="0"/>
-                        </a:ext>
-                      </a:extLst>
-                    </a:blip>
+                    <a:blip r:embed="rId5"/>
                     <a:stretch>
                       <a:fillRect/>
                     </a:stretch>
@@ -558,7 +574,7 @@
                   <pic:spPr>
                     <a:xfrm>
                       <a:off x="0" y="0"/>
-                      <a:ext cx="5943600" cy="5578475"/>
+                      <a:ext cx="6858000" cy="4111625"/>
                     </a:xfrm>
                     <a:prstGeom prst="rect">
                       <a:avLst/>
@@ -567,17 +583,8 @@
                 </pic:pic>
               </a:graphicData>
             </a:graphic>
-          </wp:anchor>
+          </wp:inline>
         </w:drawing>
-      </w:r>
-      <w:r>
-        <w:rPr>
-          <w:rFonts w:ascii="Times New Roman" w:hAnsi="Times New Roman" w:cs="Times New Roman"/>
-          <w:bCs/>
-          <w:sz w:val="22"/>
-          <w:szCs w:val="22"/>
-        </w:rPr>
-        <w:t xml:space="preserve">            Write a program that reads numbers from the user in to an array of type “float”, average</w:t>
       </w:r>
     </w:p>
     <w:p>
@@ -589,274 +596,14 @@
           <w:szCs w:val="22"/>
         </w:rPr>
       </w:pPr>
-    </w:p>
-    <w:p>
-      <w:pPr>
+      <w:r>
         <w:rPr>
           <w:rFonts w:ascii="Times New Roman" w:hAnsi="Times New Roman" w:cs="Times New Roman"/>
           <w:bCs/>
           <w:sz w:val="22"/>
           <w:szCs w:val="22"/>
         </w:rPr>
-      </w:pPr>
-    </w:p>
-    <w:p>
-      <w:pPr>
-        <w:rPr>
-          <w:rFonts w:ascii="Times New Roman" w:hAnsi="Times New Roman" w:cs="Times New Roman"/>
-          <w:bCs/>
-          <w:sz w:val="22"/>
-          <w:szCs w:val="22"/>
-        </w:rPr>
-      </w:pPr>
-    </w:p>
-    <w:p>
-      <w:pPr>
-        <w:rPr>
-          <w:rFonts w:ascii="Times New Roman" w:hAnsi="Times New Roman" w:cs="Times New Roman"/>
-          <w:bCs/>
-          <w:sz w:val="22"/>
-          <w:szCs w:val="22"/>
-        </w:rPr>
-      </w:pPr>
-    </w:p>
-    <w:p>
-      <w:pPr>
-        <w:rPr>
-          <w:rFonts w:ascii="Times New Roman" w:hAnsi="Times New Roman" w:cs="Times New Roman"/>
-          <w:bCs/>
-          <w:sz w:val="22"/>
-          <w:szCs w:val="22"/>
-        </w:rPr>
-      </w:pPr>
-    </w:p>
-    <w:p>
-      <w:pPr>
-        <w:rPr>
-          <w:rFonts w:ascii="Times New Roman" w:hAnsi="Times New Roman" w:cs="Times New Roman"/>
-          <w:bCs/>
-          <w:sz w:val="22"/>
-          <w:szCs w:val="22"/>
-        </w:rPr>
-      </w:pPr>
-    </w:p>
-    <w:p>
-      <w:pPr>
-        <w:rPr>
-          <w:rFonts w:ascii="Times New Roman" w:hAnsi="Times New Roman" w:cs="Times New Roman"/>
-          <w:bCs/>
-          <w:sz w:val="22"/>
-          <w:szCs w:val="22"/>
-        </w:rPr>
-      </w:pPr>
-    </w:p>
-    <w:p>
-      <w:pPr>
-        <w:rPr>
-          <w:rFonts w:ascii="Times New Roman" w:hAnsi="Times New Roman" w:cs="Times New Roman"/>
-          <w:bCs/>
-          <w:sz w:val="22"/>
-          <w:szCs w:val="22"/>
-        </w:rPr>
-      </w:pPr>
-    </w:p>
-    <w:p>
-      <w:pPr>
-        <w:rPr>
-          <w:rFonts w:ascii="Times New Roman" w:hAnsi="Times New Roman" w:cs="Times New Roman"/>
-          <w:bCs/>
-          <w:sz w:val="22"/>
-          <w:szCs w:val="22"/>
-        </w:rPr>
-      </w:pPr>
-    </w:p>
-    <w:p>
-      <w:pPr>
-        <w:rPr>
-          <w:rFonts w:ascii="Times New Roman" w:hAnsi="Times New Roman" w:cs="Times New Roman"/>
-          <w:bCs/>
-          <w:sz w:val="22"/>
-          <w:szCs w:val="22"/>
-        </w:rPr>
-      </w:pPr>
-    </w:p>
-    <w:p>
-      <w:pPr>
-        <w:rPr>
-          <w:rFonts w:ascii="Times New Roman" w:hAnsi="Times New Roman" w:cs="Times New Roman"/>
-          <w:bCs/>
-          <w:sz w:val="22"/>
-          <w:szCs w:val="22"/>
-        </w:rPr>
-      </w:pPr>
-    </w:p>
-    <w:p>
-      <w:pPr>
-        <w:rPr>
-          <w:rFonts w:ascii="Times New Roman" w:hAnsi="Times New Roman" w:cs="Times New Roman"/>
-          <w:bCs/>
-          <w:sz w:val="22"/>
-          <w:szCs w:val="22"/>
-        </w:rPr>
-      </w:pPr>
-    </w:p>
-    <w:p>
-      <w:pPr>
-        <w:rPr>
-          <w:rFonts w:ascii="Times New Roman" w:hAnsi="Times New Roman" w:cs="Times New Roman"/>
-          <w:bCs/>
-          <w:sz w:val="22"/>
-          <w:szCs w:val="22"/>
-        </w:rPr>
-      </w:pPr>
-    </w:p>
-    <w:p>
-      <w:pPr>
-        <w:rPr>
-          <w:rFonts w:ascii="Times New Roman" w:hAnsi="Times New Roman" w:cs="Times New Roman"/>
-          <w:bCs/>
-          <w:sz w:val="22"/>
-          <w:szCs w:val="22"/>
-        </w:rPr>
-      </w:pPr>
-    </w:p>
-    <w:p>
-      <w:pPr>
-        <w:rPr>
-          <w:rFonts w:ascii="Times New Roman" w:hAnsi="Times New Roman" w:cs="Times New Roman"/>
-          <w:bCs/>
-          <w:sz w:val="22"/>
-          <w:szCs w:val="22"/>
-        </w:rPr>
-      </w:pPr>
-    </w:p>
-    <w:p>
-      <w:pPr>
-        <w:rPr>
-          <w:rFonts w:ascii="Times New Roman" w:hAnsi="Times New Roman" w:cs="Times New Roman"/>
-          <w:bCs/>
-          <w:sz w:val="22"/>
-          <w:szCs w:val="22"/>
-        </w:rPr>
-      </w:pPr>
-    </w:p>
-    <w:p>
-      <w:pPr>
-        <w:rPr>
-          <w:rFonts w:ascii="Times New Roman" w:hAnsi="Times New Roman" w:cs="Times New Roman"/>
-          <w:bCs/>
-          <w:sz w:val="22"/>
-          <w:szCs w:val="22"/>
-        </w:rPr>
-      </w:pPr>
-    </w:p>
-    <w:p>
-      <w:pPr>
-        <w:rPr>
-          <w:rFonts w:ascii="Times New Roman" w:hAnsi="Times New Roman" w:cs="Times New Roman"/>
-          <w:bCs/>
-          <w:sz w:val="22"/>
-          <w:szCs w:val="22"/>
-        </w:rPr>
-      </w:pPr>
-    </w:p>
-    <w:p>
-      <w:pPr>
-        <w:rPr>
-          <w:rFonts w:ascii="Times New Roman" w:hAnsi="Times New Roman" w:cs="Times New Roman"/>
-          <w:bCs/>
-          <w:sz w:val="22"/>
-          <w:szCs w:val="22"/>
-        </w:rPr>
-      </w:pPr>
-    </w:p>
-    <w:p>
-      <w:pPr>
-        <w:rPr>
-          <w:rFonts w:ascii="Times New Roman" w:hAnsi="Times New Roman" w:cs="Times New Roman"/>
-          <w:bCs/>
-          <w:sz w:val="22"/>
-          <w:szCs w:val="22"/>
-        </w:rPr>
-      </w:pPr>
-    </w:p>
-    <w:p>
-      <w:pPr>
-        <w:rPr>
-          <w:rFonts w:ascii="Times New Roman" w:hAnsi="Times New Roman" w:cs="Times New Roman"/>
-          <w:bCs/>
-          <w:sz w:val="22"/>
-          <w:szCs w:val="22"/>
-        </w:rPr>
-      </w:pPr>
-    </w:p>
-    <w:p>
-      <w:pPr>
-        <w:rPr>
-          <w:rFonts w:ascii="Times New Roman" w:hAnsi="Times New Roman" w:cs="Times New Roman"/>
-          <w:bCs/>
-          <w:sz w:val="22"/>
-          <w:szCs w:val="22"/>
-        </w:rPr>
-      </w:pPr>
-    </w:p>
-    <w:p>
-      <w:pPr>
-        <w:rPr>
-          <w:rFonts w:ascii="Times New Roman" w:hAnsi="Times New Roman" w:cs="Times New Roman"/>
-          <w:bCs/>
-          <w:sz w:val="22"/>
-          <w:szCs w:val="22"/>
-        </w:rPr>
-      </w:pPr>
-    </w:p>
-    <w:p>
-      <w:pPr>
-        <w:rPr>
-          <w:rFonts w:ascii="Times New Roman" w:hAnsi="Times New Roman" w:cs="Times New Roman"/>
-          <w:bCs/>
-          <w:sz w:val="22"/>
-          <w:szCs w:val="22"/>
-        </w:rPr>
-      </w:pPr>
-    </w:p>
-    <w:p>
-      <w:pPr>
-        <w:rPr>
-          <w:rFonts w:ascii="Times New Roman" w:hAnsi="Times New Roman" w:cs="Times New Roman"/>
-          <w:bCs/>
-          <w:sz w:val="22"/>
-          <w:szCs w:val="22"/>
-        </w:rPr>
-      </w:pPr>
-    </w:p>
-    <w:p>
-      <w:pPr>
-        <w:rPr>
-          <w:rFonts w:ascii="Times New Roman" w:hAnsi="Times New Roman" w:cs="Times New Roman"/>
-          <w:bCs/>
-          <w:sz w:val="22"/>
-          <w:szCs w:val="22"/>
-        </w:rPr>
-      </w:pPr>
-    </w:p>
-    <w:p>
-      <w:pPr>
-        <w:rPr>
-          <w:rFonts w:ascii="Times New Roman" w:hAnsi="Times New Roman" w:cs="Times New Roman"/>
-          <w:bCs/>
-          <w:sz w:val="22"/>
-          <w:szCs w:val="22"/>
-        </w:rPr>
-      </w:pPr>
-      <w:r>
-        <w:rPr>
-          <w:rFonts w:ascii="Times New Roman" w:hAnsi="Times New Roman" w:cs="Times New Roman"/>
-          <w:bCs/>
-          <w:sz w:val="22"/>
-          <w:szCs w:val="22"/>
-        </w:rPr>
-        <w:t xml:space="preserve">Task 02: </w:t>
+        <w:t>Task 02: Binary Search implementation:</w:t>
       </w:r>
     </w:p>
     <w:p>
@@ -872,63 +619,15 @@
         <w:rPr>
           <w:rFonts w:ascii="Times New Roman" w:hAnsi="Times New Roman" w:cs="Times New Roman"/>
           <w:bCs/>
+          <w:noProof/>
           <w:sz w:val="22"/>
           <w:szCs w:val="22"/>
         </w:rPr>
-        <w:t>Write a function that takes an int array and array’s size as argument and return maximum</w:t>
-      </w:r>
-    </w:p>
-    <w:p>
-      <w:pPr>
-        <w:rPr>
-          <w:rFonts w:ascii="Times New Roman" w:hAnsi="Times New Roman" w:cs="Times New Roman"/>
-          <w:bCs/>
-          <w:sz w:val="22"/>
-          <w:szCs w:val="22"/>
-        </w:rPr>
-      </w:pPr>
-      <w:r>
-        <w:rPr>
-          <w:rFonts w:ascii="Times New Roman" w:hAnsi="Times New Roman" w:cs="Times New Roman"/>
-          <w:bCs/>
-          <w:sz w:val="22"/>
-          <w:szCs w:val="22"/>
-        </w:rPr>
-        <w:t>value of array elements.</w:t>
-      </w:r>
-    </w:p>
-    <w:p>
-      <w:pPr>
-        <w:rPr>
-          <w:rFonts w:ascii="Times New Roman" w:hAnsi="Times New Roman" w:cs="Times New Roman"/>
-          <w:bCs/>
-          <w:sz w:val="22"/>
-          <w:szCs w:val="22"/>
-        </w:rPr>
-      </w:pPr>
-    </w:p>
-    <w:p>
-      <w:pPr>
-        <w:rPr>
-          <w:rFonts w:ascii="Times New Roman" w:hAnsi="Times New Roman" w:cs="Times New Roman"/>
-          <w:bCs/>
-          <w:sz w:val="22"/>
-          <w:szCs w:val="22"/>
-        </w:rPr>
-      </w:pPr>
-      <w:r>
-        <w:rPr>
-          <w:rFonts w:ascii="Times New Roman" w:hAnsi="Times New Roman" w:cs="Times New Roman"/>
-          <w:bCs/>
-          <w:sz w:val="22"/>
-          <w:szCs w:val="22"/>
-        </w:rPr>
-        <w:lastRenderedPageBreak/>
         <w:drawing>
-          <wp:inline distT="0" distB="0" distL="0" distR="0" wp14:anchorId="0ED5C693" wp14:editId="66624656">
-            <wp:extent cx="6858000" cy="8187055"/>
-            <wp:effectExtent l="0" t="0" r="0" b="4445"/>
-            <wp:docPr id="4" name="Picture 4"/>
+          <wp:inline distT="0" distB="0" distL="0" distR="0" wp14:anchorId="54C1690B" wp14:editId="16BBB46E">
+            <wp:extent cx="6858000" cy="4114800"/>
+            <wp:effectExtent l="0" t="0" r="0" b="0"/>
+            <wp:docPr id="2" name="Picture 2"/>
             <wp:cNvGraphicFramePr>
               <a:graphicFrameLocks xmlns:a="http://schemas.openxmlformats.org/drawingml/2006/main" noChangeAspect="1"/>
             </wp:cNvGraphicFramePr>
@@ -948,7 +647,7 @@
                   <pic:spPr>
                     <a:xfrm>
                       <a:off x="0" y="0"/>
-                      <a:ext cx="6858000" cy="8187055"/>
+                      <a:ext cx="6858000" cy="4114800"/>
                     </a:xfrm>
                     <a:prstGeom prst="rect">
                       <a:avLst/>
@@ -965,6 +664,557 @@
       <w:pPr>
         <w:rPr>
           <w:rFonts w:ascii="Times New Roman" w:hAnsi="Times New Roman" w:cs="Times New Roman"/>
+          <w:b/>
+          <w:bCs/>
+          <w:sz w:val="22"/>
+          <w:szCs w:val="22"/>
+        </w:rPr>
+      </w:pPr>
+      <w:r>
+        <w:rPr>
+          <w:rFonts w:ascii="Times New Roman" w:hAnsi="Times New Roman" w:cs="Times New Roman"/>
+          <w:b/>
+          <w:bCs/>
+          <w:sz w:val="22"/>
+          <w:szCs w:val="22"/>
+        </w:rPr>
+        <w:lastRenderedPageBreak/>
+        <w:t>Comparison :</w:t>
+      </w:r>
+    </w:p>
+    <w:tbl>
+      <w:tblPr>
+        <w:tblW w:w="10618" w:type="dxa"/>
+        <w:tblCellSpacing w:w="15" w:type="dxa"/>
+        <w:tblBorders>
+          <w:top w:val="single" w:sz="4" w:space="0" w:color="auto"/>
+          <w:left w:val="single" w:sz="4" w:space="0" w:color="auto"/>
+          <w:bottom w:val="single" w:sz="4" w:space="0" w:color="auto"/>
+          <w:right w:val="single" w:sz="4" w:space="0" w:color="auto"/>
+          <w:insideH w:val="single" w:sz="4" w:space="0" w:color="auto"/>
+          <w:insideV w:val="single" w:sz="4" w:space="0" w:color="auto"/>
+        </w:tblBorders>
+        <w:tblCellMar>
+          <w:top w:w="15" w:type="dxa"/>
+          <w:left w:w="15" w:type="dxa"/>
+          <w:bottom w:w="15" w:type="dxa"/>
+          <w:right w:w="15" w:type="dxa"/>
+        </w:tblCellMar>
+        <w:tblLook w:val="04A0" w:firstRow="1" w:lastRow="0" w:firstColumn="1" w:lastColumn="0" w:noHBand="0" w:noVBand="1"/>
+      </w:tblPr>
+      <w:tblGrid>
+        <w:gridCol w:w="4469"/>
+        <w:gridCol w:w="3053"/>
+        <w:gridCol w:w="3096"/>
+      </w:tblGrid>
+      <w:tr>
+        <w:trPr>
+          <w:trHeight w:val="249"/>
+          <w:tblHeader/>
+          <w:tblCellSpacing w:w="15" w:type="dxa"/>
+        </w:trPr>
+        <w:tc>
+          <w:tcPr>
+            <w:tcW w:w="0" w:type="auto"/>
+            <w:vAlign w:val="center"/>
+            <w:hideMark/>
+          </w:tcPr>
+          <w:p>
+            <w:pPr>
+              <w:spacing w:after="0" w:line="240" w:lineRule="auto"/>
+              <w:jc w:val="center"/>
+              <w:rPr>
+                <w:rFonts w:ascii="Times New Roman" w:eastAsia="Times New Roman" w:hAnsi="Times New Roman" w:cs="Times New Roman"/>
+                <w:b/>
+                <w:bCs/>
+                <w:kern w:val="0"/>
+                <w14:ligatures w14:val="none"/>
+              </w:rPr>
+            </w:pPr>
+            <w:r>
+              <w:rPr>
+                <w:rFonts w:ascii="Times New Roman" w:eastAsia="Times New Roman" w:hAnsi="Times New Roman" w:cs="Times New Roman"/>
+                <w:b/>
+                <w:bCs/>
+                <w:kern w:val="0"/>
+                <w14:ligatures w14:val="none"/>
+              </w:rPr>
+              <w:t>Case</w:t>
+            </w:r>
+          </w:p>
+        </w:tc>
+        <w:tc>
+          <w:tcPr>
+            <w:tcW w:w="0" w:type="auto"/>
+            <w:vAlign w:val="center"/>
+            <w:hideMark/>
+          </w:tcPr>
+          <w:p>
+            <w:pPr>
+              <w:spacing w:after="0" w:line="240" w:lineRule="auto"/>
+              <w:jc w:val="center"/>
+              <w:rPr>
+                <w:rFonts w:ascii="Times New Roman" w:eastAsia="Times New Roman" w:hAnsi="Times New Roman" w:cs="Times New Roman"/>
+                <w:b/>
+                <w:bCs/>
+                <w:kern w:val="0"/>
+                <w14:ligatures w14:val="none"/>
+              </w:rPr>
+            </w:pPr>
+            <w:r>
+              <w:rPr>
+                <w:rFonts w:ascii="Times New Roman" w:eastAsia="Times New Roman" w:hAnsi="Times New Roman" w:cs="Times New Roman"/>
+                <w:b/>
+                <w:bCs/>
+                <w:kern w:val="0"/>
+                <w14:ligatures w14:val="none"/>
+              </w:rPr>
+              <w:t>Linear Search</w:t>
+            </w:r>
+          </w:p>
+        </w:tc>
+        <w:tc>
+          <w:tcPr>
+            <w:tcW w:w="0" w:type="auto"/>
+            <w:vAlign w:val="center"/>
+            <w:hideMark/>
+          </w:tcPr>
+          <w:p>
+            <w:pPr>
+              <w:spacing w:after="0" w:line="240" w:lineRule="auto"/>
+              <w:jc w:val="center"/>
+              <w:rPr>
+                <w:rFonts w:ascii="Times New Roman" w:eastAsia="Times New Roman" w:hAnsi="Times New Roman" w:cs="Times New Roman"/>
+                <w:b/>
+                <w:bCs/>
+                <w:kern w:val="0"/>
+                <w14:ligatures w14:val="none"/>
+              </w:rPr>
+            </w:pPr>
+            <w:r>
+              <w:rPr>
+                <w:rFonts w:ascii="Times New Roman" w:eastAsia="Times New Roman" w:hAnsi="Times New Roman" w:cs="Times New Roman"/>
+                <w:b/>
+                <w:bCs/>
+                <w:kern w:val="0"/>
+                <w14:ligatures w14:val="none"/>
+              </w:rPr>
+              <w:t>Binary Search</w:t>
+            </w:r>
+          </w:p>
+        </w:tc>
+      </w:tr>
+      <w:tr>
+        <w:trPr>
+          <w:trHeight w:val="239"/>
+          <w:tblCellSpacing w:w="15" w:type="dxa"/>
+        </w:trPr>
+        <w:tc>
+          <w:tcPr>
+            <w:tcW w:w="0" w:type="auto"/>
+            <w:vAlign w:val="center"/>
+            <w:hideMark/>
+          </w:tcPr>
+          <w:p>
+            <w:pPr>
+              <w:spacing w:after="0" w:line="240" w:lineRule="auto"/>
+              <w:rPr>
+                <w:rFonts w:ascii="Times New Roman" w:eastAsia="Times New Roman" w:hAnsi="Times New Roman" w:cs="Times New Roman"/>
+                <w:kern w:val="0"/>
+                <w14:ligatures w14:val="none"/>
+              </w:rPr>
+            </w:pPr>
+            <w:r>
+              <w:rPr>
+                <w:rFonts w:ascii="Times New Roman" w:eastAsia="Times New Roman" w:hAnsi="Times New Roman" w:cs="Times New Roman"/>
+                <w:kern w:val="0"/>
+                <w14:ligatures w14:val="none"/>
+              </w:rPr>
+              <w:t>Best Case</w:t>
+            </w:r>
+          </w:p>
+        </w:tc>
+        <w:tc>
+          <w:tcPr>
+            <w:tcW w:w="0" w:type="auto"/>
+            <w:vAlign w:val="center"/>
+            <w:hideMark/>
+          </w:tcPr>
+          <w:p>
+            <w:pPr>
+              <w:spacing w:after="0" w:line="240" w:lineRule="auto"/>
+              <w:rPr>
+                <w:rFonts w:ascii="Times New Roman" w:eastAsia="Times New Roman" w:hAnsi="Times New Roman" w:cs="Times New Roman"/>
+                <w:kern w:val="0"/>
+                <w14:ligatures w14:val="none"/>
+              </w:rPr>
+            </w:pPr>
+            <w:r>
+              <w:rPr>
+                <w:rFonts w:ascii="Times New Roman" w:eastAsia="Times New Roman" w:hAnsi="Times New Roman" w:cs="Times New Roman"/>
+                <w:kern w:val="0"/>
+                <w14:ligatures w14:val="none"/>
+              </w:rPr>
+              <w:t>O(1)</w:t>
+            </w:r>
+          </w:p>
+        </w:tc>
+        <w:tc>
+          <w:tcPr>
+            <w:tcW w:w="0" w:type="auto"/>
+            <w:vAlign w:val="center"/>
+            <w:hideMark/>
+          </w:tcPr>
+          <w:p>
+            <w:pPr>
+              <w:spacing w:after="0" w:line="240" w:lineRule="auto"/>
+              <w:rPr>
+                <w:rFonts w:ascii="Times New Roman" w:eastAsia="Times New Roman" w:hAnsi="Times New Roman" w:cs="Times New Roman"/>
+                <w:kern w:val="0"/>
+                <w14:ligatures w14:val="none"/>
+              </w:rPr>
+            </w:pPr>
+            <w:r>
+              <w:rPr>
+                <w:rFonts w:ascii="Times New Roman" w:eastAsia="Times New Roman" w:hAnsi="Times New Roman" w:cs="Times New Roman"/>
+                <w:kern w:val="0"/>
+                <w14:ligatures w14:val="none"/>
+              </w:rPr>
+              <w:t>O(1)</w:t>
+            </w:r>
+          </w:p>
+        </w:tc>
+      </w:tr>
+      <w:tr>
+        <w:trPr>
+          <w:trHeight w:val="249"/>
+          <w:tblCellSpacing w:w="15" w:type="dxa"/>
+        </w:trPr>
+        <w:tc>
+          <w:tcPr>
+            <w:tcW w:w="0" w:type="auto"/>
+            <w:vAlign w:val="center"/>
+            <w:hideMark/>
+          </w:tcPr>
+          <w:p>
+            <w:pPr>
+              <w:spacing w:after="0" w:line="240" w:lineRule="auto"/>
+              <w:rPr>
+                <w:rFonts w:ascii="Times New Roman" w:eastAsia="Times New Roman" w:hAnsi="Times New Roman" w:cs="Times New Roman"/>
+                <w:kern w:val="0"/>
+                <w14:ligatures w14:val="none"/>
+              </w:rPr>
+            </w:pPr>
+            <w:r>
+              <w:rPr>
+                <w:rFonts w:ascii="Times New Roman" w:eastAsia="Times New Roman" w:hAnsi="Times New Roman" w:cs="Times New Roman"/>
+                <w:kern w:val="0"/>
+                <w14:ligatures w14:val="none"/>
+              </w:rPr>
+              <w:t>Average Case</w:t>
+            </w:r>
+          </w:p>
+        </w:tc>
+        <w:tc>
+          <w:tcPr>
+            <w:tcW w:w="0" w:type="auto"/>
+            <w:vAlign w:val="center"/>
+            <w:hideMark/>
+          </w:tcPr>
+          <w:p>
+            <w:pPr>
+              <w:spacing w:after="0" w:line="240" w:lineRule="auto"/>
+              <w:rPr>
+                <w:rFonts w:ascii="Times New Roman" w:eastAsia="Times New Roman" w:hAnsi="Times New Roman" w:cs="Times New Roman"/>
+                <w:kern w:val="0"/>
+                <w14:ligatures w14:val="none"/>
+              </w:rPr>
+            </w:pPr>
+            <w:r>
+              <w:rPr>
+                <w:rFonts w:ascii="Times New Roman" w:eastAsia="Times New Roman" w:hAnsi="Times New Roman" w:cs="Times New Roman"/>
+                <w:kern w:val="0"/>
+                <w14:ligatures w14:val="none"/>
+              </w:rPr>
+              <w:t>O(n)</w:t>
+            </w:r>
+          </w:p>
+        </w:tc>
+        <w:tc>
+          <w:tcPr>
+            <w:tcW w:w="0" w:type="auto"/>
+            <w:vAlign w:val="center"/>
+            <w:hideMark/>
+          </w:tcPr>
+          <w:p>
+            <w:pPr>
+              <w:spacing w:after="0" w:line="240" w:lineRule="auto"/>
+              <w:rPr>
+                <w:rFonts w:ascii="Times New Roman" w:eastAsia="Times New Roman" w:hAnsi="Times New Roman" w:cs="Times New Roman"/>
+                <w:kern w:val="0"/>
+                <w14:ligatures w14:val="none"/>
+              </w:rPr>
+            </w:pPr>
+            <w:r>
+              <w:rPr>
+                <w:rFonts w:ascii="Times New Roman" w:eastAsia="Times New Roman" w:hAnsi="Times New Roman" w:cs="Times New Roman"/>
+                <w:kern w:val="0"/>
+                <w14:ligatures w14:val="none"/>
+              </w:rPr>
+              <w:t>O(log n)</w:t>
+            </w:r>
+          </w:p>
+        </w:tc>
+      </w:tr>
+      <w:tr>
+        <w:trPr>
+          <w:trHeight w:val="249"/>
+          <w:tblCellSpacing w:w="15" w:type="dxa"/>
+        </w:trPr>
+        <w:tc>
+          <w:tcPr>
+            <w:tcW w:w="0" w:type="auto"/>
+            <w:vAlign w:val="center"/>
+            <w:hideMark/>
+          </w:tcPr>
+          <w:p>
+            <w:pPr>
+              <w:spacing w:after="0" w:line="240" w:lineRule="auto"/>
+              <w:rPr>
+                <w:rFonts w:ascii="Times New Roman" w:eastAsia="Times New Roman" w:hAnsi="Times New Roman" w:cs="Times New Roman"/>
+                <w:kern w:val="0"/>
+                <w14:ligatures w14:val="none"/>
+              </w:rPr>
+            </w:pPr>
+            <w:r>
+              <w:rPr>
+                <w:rFonts w:ascii="Times New Roman" w:eastAsia="Times New Roman" w:hAnsi="Times New Roman" w:cs="Times New Roman"/>
+                <w:kern w:val="0"/>
+                <w14:ligatures w14:val="none"/>
+              </w:rPr>
+              <w:t>Worst Case</w:t>
+            </w:r>
+          </w:p>
+        </w:tc>
+        <w:tc>
+          <w:tcPr>
+            <w:tcW w:w="0" w:type="auto"/>
+            <w:vAlign w:val="center"/>
+            <w:hideMark/>
+          </w:tcPr>
+          <w:p>
+            <w:pPr>
+              <w:spacing w:after="0" w:line="240" w:lineRule="auto"/>
+              <w:rPr>
+                <w:rFonts w:ascii="Times New Roman" w:eastAsia="Times New Roman" w:hAnsi="Times New Roman" w:cs="Times New Roman"/>
+                <w:kern w:val="0"/>
+                <w14:ligatures w14:val="none"/>
+              </w:rPr>
+            </w:pPr>
+            <w:r>
+              <w:rPr>
+                <w:rFonts w:ascii="Times New Roman" w:eastAsia="Times New Roman" w:hAnsi="Times New Roman" w:cs="Times New Roman"/>
+                <w:kern w:val="0"/>
+                <w14:ligatures w14:val="none"/>
+              </w:rPr>
+              <w:t>O(n)</w:t>
+            </w:r>
+          </w:p>
+        </w:tc>
+        <w:tc>
+          <w:tcPr>
+            <w:tcW w:w="0" w:type="auto"/>
+            <w:vAlign w:val="center"/>
+            <w:hideMark/>
+          </w:tcPr>
+          <w:p>
+            <w:pPr>
+              <w:spacing w:after="0" w:line="240" w:lineRule="auto"/>
+              <w:rPr>
+                <w:rFonts w:ascii="Times New Roman" w:eastAsia="Times New Roman" w:hAnsi="Times New Roman" w:cs="Times New Roman"/>
+                <w:kern w:val="0"/>
+                <w14:ligatures w14:val="none"/>
+              </w:rPr>
+            </w:pPr>
+            <w:r>
+              <w:rPr>
+                <w:rFonts w:ascii="Times New Roman" w:eastAsia="Times New Roman" w:hAnsi="Times New Roman" w:cs="Times New Roman"/>
+                <w:kern w:val="0"/>
+                <w14:ligatures w14:val="none"/>
+              </w:rPr>
+              <w:t>O(log n)</w:t>
+            </w:r>
+          </w:p>
+        </w:tc>
+      </w:tr>
+      <w:tr>
+        <w:trPr>
+          <w:trHeight w:val="239"/>
+          <w:tblCellSpacing w:w="15" w:type="dxa"/>
+        </w:trPr>
+        <w:tc>
+          <w:tcPr>
+            <w:tcW w:w="0" w:type="auto"/>
+            <w:vAlign w:val="center"/>
+            <w:hideMark/>
+          </w:tcPr>
+          <w:p>
+            <w:pPr>
+              <w:spacing w:after="0" w:line="240" w:lineRule="auto"/>
+              <w:rPr>
+                <w:rFonts w:ascii="Times New Roman" w:eastAsia="Times New Roman" w:hAnsi="Times New Roman" w:cs="Times New Roman"/>
+                <w:kern w:val="0"/>
+                <w14:ligatures w14:val="none"/>
+              </w:rPr>
+            </w:pPr>
+            <w:r>
+              <w:rPr>
+                <w:rFonts w:ascii="Times New Roman" w:eastAsia="Times New Roman" w:hAnsi="Times New Roman" w:cs="Times New Roman"/>
+                <w:kern w:val="0"/>
+                <w14:ligatures w14:val="none"/>
+              </w:rPr>
+              <w:t>Requires Sorted Array</w:t>
+            </w:r>
+          </w:p>
+        </w:tc>
+        <w:tc>
+          <w:tcPr>
+            <w:tcW w:w="0" w:type="auto"/>
+            <w:vAlign w:val="center"/>
+            <w:hideMark/>
+          </w:tcPr>
+          <w:p>
+            <w:pPr>
+              <w:spacing w:after="0" w:line="240" w:lineRule="auto"/>
+              <w:rPr>
+                <w:rFonts w:ascii="Times New Roman" w:eastAsia="Times New Roman" w:hAnsi="Times New Roman" w:cs="Times New Roman"/>
+                <w:kern w:val="0"/>
+                <w14:ligatures w14:val="none"/>
+              </w:rPr>
+            </w:pPr>
+            <w:r>
+              <w:rPr>
+                <w:rFonts w:ascii="Times New Roman" w:eastAsia="Times New Roman" w:hAnsi="Times New Roman" w:cs="Times New Roman"/>
+                <w:kern w:val="0"/>
+                <w14:ligatures w14:val="none"/>
+              </w:rPr>
+              <w:t>No</w:t>
+            </w:r>
+          </w:p>
+        </w:tc>
+        <w:tc>
+          <w:tcPr>
+            <w:tcW w:w="0" w:type="auto"/>
+            <w:vAlign w:val="center"/>
+            <w:hideMark/>
+          </w:tcPr>
+          <w:p>
+            <w:pPr>
+              <w:spacing w:after="0" w:line="240" w:lineRule="auto"/>
+              <w:rPr>
+                <w:rFonts w:ascii="Times New Roman" w:eastAsia="Times New Roman" w:hAnsi="Times New Roman" w:cs="Times New Roman"/>
+                <w:kern w:val="0"/>
+                <w14:ligatures w14:val="none"/>
+              </w:rPr>
+            </w:pPr>
+            <w:r>
+              <w:rPr>
+                <w:rFonts w:ascii="Times New Roman" w:eastAsia="Times New Roman" w:hAnsi="Times New Roman" w:cs="Times New Roman"/>
+                <w:kern w:val="0"/>
+                <w14:ligatures w14:val="none"/>
+              </w:rPr>
+              <w:t>Yes</w:t>
+            </w:r>
+          </w:p>
+        </w:tc>
+      </w:tr>
+      <w:tr>
+        <w:trPr>
+          <w:trHeight w:val="249"/>
+          <w:tblCellSpacing w:w="15" w:type="dxa"/>
+        </w:trPr>
+        <w:tc>
+          <w:tcPr>
+            <w:tcW w:w="0" w:type="auto"/>
+            <w:vAlign w:val="center"/>
+            <w:hideMark/>
+          </w:tcPr>
+          <w:p>
+            <w:pPr>
+              <w:spacing w:after="0" w:line="240" w:lineRule="auto"/>
+              <w:rPr>
+                <w:rFonts w:ascii="Times New Roman" w:eastAsia="Times New Roman" w:hAnsi="Times New Roman" w:cs="Times New Roman"/>
+                <w:kern w:val="0"/>
+                <w14:ligatures w14:val="none"/>
+              </w:rPr>
+            </w:pPr>
+            <w:r>
+              <w:rPr>
+                <w:rFonts w:ascii="Times New Roman" w:eastAsia="Times New Roman" w:hAnsi="Times New Roman" w:cs="Times New Roman"/>
+                <w:kern w:val="0"/>
+                <w14:ligatures w14:val="none"/>
+              </w:rPr>
+              <w:t>Space Complexity</w:t>
+            </w:r>
+          </w:p>
+        </w:tc>
+        <w:tc>
+          <w:tcPr>
+            <w:tcW w:w="0" w:type="auto"/>
+            <w:vAlign w:val="center"/>
+            <w:hideMark/>
+          </w:tcPr>
+          <w:p>
+            <w:pPr>
+              <w:spacing w:after="0" w:line="240" w:lineRule="auto"/>
+              <w:rPr>
+                <w:rFonts w:ascii="Times New Roman" w:eastAsia="Times New Roman" w:hAnsi="Times New Roman" w:cs="Times New Roman"/>
+                <w:kern w:val="0"/>
+                <w14:ligatures w14:val="none"/>
+              </w:rPr>
+            </w:pPr>
+            <w:r>
+              <w:rPr>
+                <w:rFonts w:ascii="Times New Roman" w:eastAsia="Times New Roman" w:hAnsi="Times New Roman" w:cs="Times New Roman"/>
+                <w:kern w:val="0"/>
+                <w14:ligatures w14:val="none"/>
+              </w:rPr>
+              <w:t>O(1)</w:t>
+            </w:r>
+          </w:p>
+        </w:tc>
+        <w:tc>
+          <w:tcPr>
+            <w:tcW w:w="0" w:type="auto"/>
+            <w:vAlign w:val="center"/>
+            <w:hideMark/>
+          </w:tcPr>
+          <w:p>
+            <w:pPr>
+              <w:spacing w:after="0" w:line="240" w:lineRule="auto"/>
+              <w:rPr>
+                <w:rFonts w:ascii="Times New Roman" w:eastAsia="Times New Roman" w:hAnsi="Times New Roman" w:cs="Times New Roman"/>
+                <w:kern w:val="0"/>
+                <w14:ligatures w14:val="none"/>
+              </w:rPr>
+            </w:pPr>
+            <w:r>
+              <w:rPr>
+                <w:rFonts w:ascii="Times New Roman" w:eastAsia="Times New Roman" w:hAnsi="Times New Roman" w:cs="Times New Roman"/>
+                <w:kern w:val="0"/>
+                <w14:ligatures w14:val="none"/>
+              </w:rPr>
+              <w:t>O(1)</w:t>
+            </w:r>
+          </w:p>
+        </w:tc>
+      </w:tr>
+    </w:tbl>
+    <w:p>
+      <w:pPr>
+        <w:rPr>
+          <w:rFonts w:ascii="Times New Roman" w:hAnsi="Times New Roman" w:cs="Times New Roman"/>
+          <w:b/>
           <w:bCs/>
           <w:sz w:val="22"/>
           <w:szCs w:val="22"/>
@@ -975,6 +1225,7 @@
       <w:pPr>
         <w:rPr>
           <w:rFonts w:ascii="Times New Roman" w:hAnsi="Times New Roman" w:cs="Times New Roman"/>
+          <w:b/>
           <w:bCs/>
           <w:sz w:val="22"/>
           <w:szCs w:val="22"/>
@@ -990,258 +1241,7 @@
           <w:szCs w:val="22"/>
         </w:rPr>
       </w:pPr>
-    </w:p>
-    <w:p>
-      <w:pPr>
-        <w:rPr>
-          <w:rFonts w:ascii="Times New Roman" w:hAnsi="Times New Roman" w:cs="Times New Roman"/>
-          <w:bCs/>
-          <w:sz w:val="22"/>
-          <w:szCs w:val="22"/>
-        </w:rPr>
-      </w:pPr>
       <w:r>
-        <w:rPr>
-          <w:rFonts w:ascii="Times New Roman" w:hAnsi="Times New Roman" w:cs="Times New Roman"/>
-          <w:bCs/>
-          <w:sz w:val="22"/>
-          <w:szCs w:val="22"/>
-        </w:rPr>
-        <w:lastRenderedPageBreak/>
-        <w:t>Task 03:</w:t>
-      </w:r>
-    </w:p>
-    <w:p>
-      <w:pPr>
-        <w:rPr>
-          <w:rFonts w:ascii="Times New Roman" w:hAnsi="Times New Roman" w:cs="Times New Roman"/>
-          <w:bCs/>
-          <w:sz w:val="22"/>
-          <w:szCs w:val="22"/>
-        </w:rPr>
-      </w:pPr>
-      <w:r>
-        <w:rPr>
-          <w:rFonts w:ascii="Times New Roman" w:hAnsi="Times New Roman" w:cs="Times New Roman"/>
-          <w:bCs/>
-          <w:sz w:val="22"/>
-          <w:szCs w:val="22"/>
-        </w:rPr>
-        <w:t>Write a function that takes an int array and the array's size as arguments. It should create</w:t>
-      </w:r>
-      <w:r>
-        <w:rPr>
-          <w:rFonts w:ascii="Times New Roman" w:hAnsi="Times New Roman" w:cs="Times New Roman"/>
-          <w:bCs/>
-          <w:sz w:val="22"/>
-          <w:szCs w:val="22"/>
-        </w:rPr>
-        <w:t xml:space="preserve"> </w:t>
-      </w:r>
-      <w:r>
-        <w:rPr>
-          <w:rFonts w:ascii="Times New Roman" w:hAnsi="Times New Roman" w:cs="Times New Roman"/>
-          <w:bCs/>
-          <w:sz w:val="22"/>
-          <w:szCs w:val="22"/>
-        </w:rPr>
-        <w:t>a new array that is twice the size of the argument array. The function should copy the</w:t>
-      </w:r>
-      <w:r>
-        <w:rPr>
-          <w:rFonts w:ascii="Times New Roman" w:hAnsi="Times New Roman" w:cs="Times New Roman"/>
-          <w:bCs/>
-          <w:sz w:val="22"/>
-          <w:szCs w:val="22"/>
-        </w:rPr>
-        <w:t xml:space="preserve"> </w:t>
-      </w:r>
-      <w:r>
-        <w:rPr>
-          <w:rFonts w:ascii="Times New Roman" w:hAnsi="Times New Roman" w:cs="Times New Roman"/>
-          <w:bCs/>
-          <w:sz w:val="22"/>
-          <w:szCs w:val="22"/>
-        </w:rPr>
-        <w:t>contents of the argument array to the new array, and initialize the unused elements of new</w:t>
-      </w:r>
-      <w:r>
-        <w:rPr>
-          <w:rFonts w:ascii="Times New Roman" w:hAnsi="Times New Roman" w:cs="Times New Roman"/>
-          <w:bCs/>
-          <w:sz w:val="22"/>
-          <w:szCs w:val="22"/>
-        </w:rPr>
-        <w:t xml:space="preserve"> </w:t>
-      </w:r>
-      <w:r>
-        <w:rPr>
-          <w:rFonts w:ascii="Times New Roman" w:hAnsi="Times New Roman" w:cs="Times New Roman"/>
-          <w:bCs/>
-          <w:sz w:val="22"/>
-          <w:szCs w:val="22"/>
-        </w:rPr>
-        <w:t>array with -1. The function should return a pointer to the new array.</w:t>
-      </w:r>
-    </w:p>
-    <w:p>
-      <w:pPr>
-        <w:rPr>
-          <w:rFonts w:ascii="Times New Roman" w:hAnsi="Times New Roman" w:cs="Times New Roman"/>
-          <w:bCs/>
-          <w:sz w:val="22"/>
-          <w:szCs w:val="22"/>
-        </w:rPr>
-      </w:pPr>
-      <w:r>
-        <w:rPr>
-          <w:rFonts w:ascii="Times New Roman" w:hAnsi="Times New Roman" w:cs="Times New Roman"/>
-          <w:bCs/>
-          <w:sz w:val="22"/>
-          <w:szCs w:val="22"/>
-        </w:rPr>
-        <w:drawing>
-          <wp:inline distT="0" distB="0" distL="0" distR="0" wp14:anchorId="62DAF388" wp14:editId="04BD8266">
-            <wp:extent cx="5628005" cy="7893569"/>
-            <wp:effectExtent l="0" t="0" r="0" b="0"/>
-            <wp:docPr id="5" name="Picture 5"/>
-            <wp:cNvGraphicFramePr>
-              <a:graphicFrameLocks xmlns:a="http://schemas.openxmlformats.org/drawingml/2006/main" noChangeAspect="1"/>
-            </wp:cNvGraphicFramePr>
-            <a:graphic xmlns:a="http://schemas.openxmlformats.org/drawingml/2006/main">
-              <a:graphicData uri="http://schemas.openxmlformats.org/drawingml/2006/picture">
-                <pic:pic xmlns:pic="http://schemas.openxmlformats.org/drawingml/2006/picture">
-                  <pic:nvPicPr>
-                    <pic:cNvPr id="1" name=""/>
-                    <pic:cNvPicPr/>
-                  </pic:nvPicPr>
-                  <pic:blipFill>
-                    <a:blip r:embed="rId7"/>
-                    <a:stretch>
-                      <a:fillRect/>
-                    </a:stretch>
-                  </pic:blipFill>
-                  <pic:spPr>
-                    <a:xfrm>
-                      <a:off x="0" y="0"/>
-                      <a:ext cx="5633179" cy="7900825"/>
-                    </a:xfrm>
-                    <a:prstGeom prst="rect">
-                      <a:avLst/>
-                    </a:prstGeom>
-                  </pic:spPr>
-                </pic:pic>
-              </a:graphicData>
-            </a:graphic>
-          </wp:inline>
-        </w:drawing>
-      </w:r>
-    </w:p>
-    <w:p>
-      <w:pPr>
-        <w:rPr>
-          <w:rFonts w:ascii="Times New Roman" w:hAnsi="Times New Roman" w:cs="Times New Roman"/>
-          <w:bCs/>
-          <w:sz w:val="22"/>
-          <w:szCs w:val="22"/>
-        </w:rPr>
-      </w:pPr>
-    </w:p>
-    <w:p>
-      <w:pPr>
-        <w:rPr>
-          <w:rFonts w:ascii="Times New Roman" w:hAnsi="Times New Roman" w:cs="Times New Roman"/>
-          <w:bCs/>
-          <w:sz w:val="22"/>
-          <w:szCs w:val="22"/>
-        </w:rPr>
-      </w:pPr>
-      <w:r>
-        <w:rPr>
-          <w:rFonts w:ascii="Times New Roman" w:hAnsi="Times New Roman" w:cs="Times New Roman"/>
-          <w:bCs/>
-          <w:sz w:val="22"/>
-          <w:szCs w:val="22"/>
-        </w:rPr>
-        <w:lastRenderedPageBreak/>
-        <w:t xml:space="preserve">Task 4: </w:t>
-      </w:r>
-      <w:r>
-        <w:rPr>
-          <w:rFonts w:ascii="Times New Roman" w:hAnsi="Times New Roman" w:cs="Times New Roman"/>
-          <w:bCs/>
-          <w:sz w:val="22"/>
-          <w:szCs w:val="22"/>
-        </w:rPr>
-        <w:t>Write a function that takes two int arrays and the arrays' sizes as arguments. It should</w:t>
-      </w:r>
-      <w:r>
-        <w:rPr>
-          <w:rFonts w:ascii="Times New Roman" w:hAnsi="Times New Roman" w:cs="Times New Roman"/>
-          <w:bCs/>
-          <w:sz w:val="22"/>
-          <w:szCs w:val="22"/>
-        </w:rPr>
-        <w:t xml:space="preserve"> </w:t>
-      </w:r>
-      <w:r>
-        <w:rPr>
-          <w:rFonts w:ascii="Times New Roman" w:hAnsi="Times New Roman" w:cs="Times New Roman"/>
-          <w:bCs/>
-          <w:sz w:val="22"/>
-          <w:szCs w:val="22"/>
-        </w:rPr>
-        <w:t>create a new array big enough to store both arrays. Then it should copy the contents of the</w:t>
-      </w:r>
-      <w:r>
-        <w:rPr>
-          <w:rFonts w:ascii="Times New Roman" w:hAnsi="Times New Roman" w:cs="Times New Roman"/>
-          <w:bCs/>
-          <w:sz w:val="22"/>
-          <w:szCs w:val="22"/>
-        </w:rPr>
-        <w:t xml:space="preserve"> </w:t>
-      </w:r>
-      <w:r>
-        <w:rPr>
-          <w:rFonts w:ascii="Times New Roman" w:hAnsi="Times New Roman" w:cs="Times New Roman"/>
-          <w:bCs/>
-          <w:sz w:val="22"/>
-          <w:szCs w:val="22"/>
-        </w:rPr>
-        <w:t>first array to the new array, and then copy the contents of the second array to the new</w:t>
-      </w:r>
-      <w:r>
-        <w:rPr>
-          <w:rFonts w:ascii="Times New Roman" w:hAnsi="Times New Roman" w:cs="Times New Roman"/>
-          <w:bCs/>
-          <w:sz w:val="22"/>
-          <w:szCs w:val="22"/>
-        </w:rPr>
-        <w:t xml:space="preserve"> </w:t>
-      </w:r>
-      <w:r>
-        <w:rPr>
-          <w:rFonts w:ascii="Times New Roman" w:hAnsi="Times New Roman" w:cs="Times New Roman"/>
-          <w:bCs/>
-          <w:sz w:val="22"/>
-          <w:szCs w:val="22"/>
-        </w:rPr>
-        <w:t>array in the remaining elements, and return a pointer to the new array.</w:t>
-      </w:r>
-    </w:p>
-    <w:p>
-      <w:pPr>
-        <w:rPr>
-          <w:rFonts w:ascii="Times New Roman" w:hAnsi="Times New Roman" w:cs="Times New Roman"/>
-          <w:bCs/>
-          <w:sz w:val="22"/>
-          <w:szCs w:val="22"/>
-        </w:rPr>
-      </w:pPr>
-    </w:p>
-    <w:p>
-      <w:pPr>
         <w:rPr>
           <w:rFonts w:ascii="Times New Roman" w:hAnsi="Times New Roman" w:cs="Times New Roman"/>
           <w:b/>
@@ -1249,234 +1249,6 @@
           <w:sz w:val="22"/>
           <w:szCs w:val="22"/>
         </w:rPr>
-      </w:pPr>
-      <w:r>
-        <w:rPr>
-          <w:rFonts w:ascii="Times New Roman" w:hAnsi="Times New Roman" w:cs="Times New Roman"/>
-          <w:bCs/>
-          <w:sz w:val="22"/>
-          <w:szCs w:val="22"/>
-        </w:rPr>
-        <w:drawing>
-          <wp:inline distT="0" distB="0" distL="0" distR="0" wp14:anchorId="367D548D" wp14:editId="0561034E">
-            <wp:extent cx="6858000" cy="3732530"/>
-            <wp:effectExtent l="0" t="0" r="0" b="1270"/>
-            <wp:docPr id="6" name="Picture 6"/>
-            <wp:cNvGraphicFramePr>
-              <a:graphicFrameLocks xmlns:a="http://schemas.openxmlformats.org/drawingml/2006/main" noChangeAspect="1"/>
-            </wp:cNvGraphicFramePr>
-            <a:graphic xmlns:a="http://schemas.openxmlformats.org/drawingml/2006/main">
-              <a:graphicData uri="http://schemas.openxmlformats.org/drawingml/2006/picture">
-                <pic:pic xmlns:pic="http://schemas.openxmlformats.org/drawingml/2006/picture">
-                  <pic:nvPicPr>
-                    <pic:cNvPr id="1" name=""/>
-                    <pic:cNvPicPr/>
-                  </pic:nvPicPr>
-                  <pic:blipFill>
-                    <a:blip r:embed="rId8"/>
-                    <a:stretch>
-                      <a:fillRect/>
-                    </a:stretch>
-                  </pic:blipFill>
-                  <pic:spPr>
-                    <a:xfrm>
-                      <a:off x="0" y="0"/>
-                      <a:ext cx="6858000" cy="3732530"/>
-                    </a:xfrm>
-                    <a:prstGeom prst="rect">
-                      <a:avLst/>
-                    </a:prstGeom>
-                  </pic:spPr>
-                </pic:pic>
-              </a:graphicData>
-            </a:graphic>
-          </wp:inline>
-        </w:drawing>
-      </w:r>
-    </w:p>
-    <w:p>
-      <w:pPr>
-        <w:rPr>
-          <w:rFonts w:ascii="Times New Roman" w:hAnsi="Times New Roman" w:cs="Times New Roman"/>
-          <w:b/>
-          <w:bCs/>
-          <w:sz w:val="22"/>
-          <w:szCs w:val="22"/>
-        </w:rPr>
-      </w:pPr>
-    </w:p>
-    <w:p>
-      <w:pPr>
-        <w:rPr>
-          <w:rFonts w:ascii="Times New Roman" w:hAnsi="Times New Roman" w:cs="Times New Roman"/>
-          <w:b/>
-          <w:bCs/>
-          <w:sz w:val="22"/>
-          <w:szCs w:val="22"/>
-        </w:rPr>
-      </w:pPr>
-    </w:p>
-    <w:p>
-      <w:pPr>
-        <w:rPr>
-          <w:rFonts w:ascii="Times New Roman" w:hAnsi="Times New Roman" w:cs="Times New Roman"/>
-          <w:b/>
-          <w:bCs/>
-          <w:sz w:val="22"/>
-          <w:szCs w:val="22"/>
-        </w:rPr>
-      </w:pPr>
-    </w:p>
-    <w:p>
-      <w:pPr>
-        <w:rPr>
-          <w:rFonts w:ascii="Times New Roman" w:hAnsi="Times New Roman" w:cs="Times New Roman"/>
-          <w:b/>
-          <w:bCs/>
-          <w:sz w:val="22"/>
-          <w:szCs w:val="22"/>
-        </w:rPr>
-      </w:pPr>
-    </w:p>
-    <w:p>
-      <w:pPr>
-        <w:rPr>
-          <w:rFonts w:ascii="Times New Roman" w:hAnsi="Times New Roman" w:cs="Times New Roman"/>
-          <w:b/>
-          <w:bCs/>
-          <w:sz w:val="22"/>
-          <w:szCs w:val="22"/>
-        </w:rPr>
-      </w:pPr>
-    </w:p>
-    <w:p>
-      <w:pPr>
-        <w:rPr>
-          <w:rFonts w:ascii="Times New Roman" w:hAnsi="Times New Roman" w:cs="Times New Roman"/>
-          <w:b/>
-          <w:bCs/>
-          <w:sz w:val="22"/>
-          <w:szCs w:val="22"/>
-        </w:rPr>
-      </w:pPr>
-    </w:p>
-    <w:p>
-      <w:pPr>
-        <w:rPr>
-          <w:rFonts w:ascii="Times New Roman" w:hAnsi="Times New Roman" w:cs="Times New Roman"/>
-          <w:b/>
-          <w:bCs/>
-          <w:sz w:val="22"/>
-          <w:szCs w:val="22"/>
-        </w:rPr>
-      </w:pPr>
-    </w:p>
-    <w:p>
-      <w:pPr>
-        <w:rPr>
-          <w:rFonts w:ascii="Times New Roman" w:hAnsi="Times New Roman" w:cs="Times New Roman"/>
-          <w:b/>
-          <w:bCs/>
-          <w:sz w:val="22"/>
-          <w:szCs w:val="22"/>
-        </w:rPr>
-      </w:pPr>
-    </w:p>
-    <w:p>
-      <w:pPr>
-        <w:rPr>
-          <w:rFonts w:ascii="Times New Roman" w:hAnsi="Times New Roman" w:cs="Times New Roman"/>
-          <w:b/>
-          <w:bCs/>
-          <w:sz w:val="22"/>
-          <w:szCs w:val="22"/>
-        </w:rPr>
-      </w:pPr>
-    </w:p>
-    <w:p>
-      <w:pPr>
-        <w:rPr>
-          <w:rFonts w:ascii="Times New Roman" w:hAnsi="Times New Roman" w:cs="Times New Roman"/>
-          <w:b/>
-          <w:bCs/>
-          <w:sz w:val="22"/>
-          <w:szCs w:val="22"/>
-        </w:rPr>
-      </w:pPr>
-    </w:p>
-    <w:p>
-      <w:pPr>
-        <w:rPr>
-          <w:rFonts w:ascii="Times New Roman" w:hAnsi="Times New Roman" w:cs="Times New Roman"/>
-          <w:b/>
-          <w:bCs/>
-          <w:sz w:val="22"/>
-          <w:szCs w:val="22"/>
-        </w:rPr>
-      </w:pPr>
-    </w:p>
-    <w:p>
-      <w:pPr>
-        <w:rPr>
-          <w:rFonts w:ascii="Times New Roman" w:hAnsi="Times New Roman" w:cs="Times New Roman"/>
-          <w:b/>
-          <w:bCs/>
-          <w:sz w:val="22"/>
-          <w:szCs w:val="22"/>
-        </w:rPr>
-      </w:pPr>
-    </w:p>
-    <w:p>
-      <w:pPr>
-        <w:rPr>
-          <w:rFonts w:ascii="Times New Roman" w:hAnsi="Times New Roman" w:cs="Times New Roman"/>
-          <w:b/>
-          <w:bCs/>
-          <w:sz w:val="22"/>
-          <w:szCs w:val="22"/>
-        </w:rPr>
-      </w:pPr>
-    </w:p>
-    <w:p>
-      <w:pPr>
-        <w:rPr>
-          <w:rFonts w:ascii="Times New Roman" w:hAnsi="Times New Roman" w:cs="Times New Roman"/>
-          <w:b/>
-          <w:bCs/>
-          <w:sz w:val="22"/>
-          <w:szCs w:val="22"/>
-        </w:rPr>
-      </w:pPr>
-    </w:p>
-    <w:p>
-      <w:pPr>
-        <w:rPr>
-          <w:rFonts w:ascii="Times New Roman" w:hAnsi="Times New Roman" w:cs="Times New Roman"/>
-          <w:b/>
-          <w:bCs/>
-          <w:sz w:val="22"/>
-          <w:szCs w:val="22"/>
-        </w:rPr>
-      </w:pPr>
-    </w:p>
-    <w:p>
-      <w:pPr>
-        <w:rPr>
-          <w:rFonts w:ascii="Times New Roman" w:hAnsi="Times New Roman" w:cs="Times New Roman"/>
-          <w:bCs/>
-          <w:sz w:val="22"/>
-          <w:szCs w:val="22"/>
-        </w:rPr>
-      </w:pPr>
-      <w:r>
-        <w:rPr>
-          <w:rFonts w:ascii="Times New Roman" w:hAnsi="Times New Roman" w:cs="Times New Roman"/>
-          <w:b/>
-          <w:bCs/>
-          <w:sz w:val="22"/>
-          <w:szCs w:val="22"/>
-        </w:rPr>
-        <w:lastRenderedPageBreak/>
         <w:t>RUBRICS (LABS/ PROJECTS):</w:t>
       </w:r>
     </w:p>
@@ -1890,29 +1662,7 @@
                 <w:sz w:val="22"/>
                 <w:szCs w:val="22"/>
               </w:rPr>
-              <w:t xml:space="preserve">Valuing </w:t>
-            </w:r>
-            <w:proofErr w:type="gramStart"/>
-            <w:r>
-              <w:rPr>
-                <w:rFonts w:ascii="Times New Roman" w:hAnsi="Times New Roman" w:cs="Times New Roman"/>
-                <w:b/>
-                <w:bCs/>
-                <w:sz w:val="22"/>
-                <w:szCs w:val="22"/>
-              </w:rPr>
-              <w:t>related  to</w:t>
-            </w:r>
-            <w:proofErr w:type="gramEnd"/>
-            <w:r>
-              <w:rPr>
-                <w:rFonts w:ascii="Times New Roman" w:hAnsi="Times New Roman" w:cs="Times New Roman"/>
-                <w:b/>
-                <w:bCs/>
-                <w:sz w:val="22"/>
-                <w:szCs w:val="22"/>
-              </w:rPr>
-              <w:t xml:space="preserve"> work,  </w:t>
+              <w:t>Valuing related  to work,  </w:t>
             </w:r>
           </w:p>
           <w:p>
@@ -1944,27 +1694,15 @@
                 <w:szCs w:val="22"/>
               </w:rPr>
             </w:pPr>
-            <w:proofErr w:type="gramStart"/>
-            <w:r>
-              <w:rPr>
-                <w:rFonts w:ascii="Times New Roman" w:hAnsi="Times New Roman" w:cs="Times New Roman"/>
-                <w:b/>
-                <w:bCs/>
-                <w:sz w:val="22"/>
-                <w:szCs w:val="22"/>
-              </w:rPr>
-              <w:t>responsibility,  and</w:t>
-            </w:r>
-            <w:proofErr w:type="gramEnd"/>
-            <w:r>
-              <w:rPr>
-                <w:rFonts w:ascii="Times New Roman" w:hAnsi="Times New Roman" w:cs="Times New Roman"/>
-                <w:b/>
-                <w:bCs/>
-                <w:sz w:val="22"/>
-                <w:szCs w:val="22"/>
-              </w:rPr>
-              <w:t>  </w:t>
+            <w:r>
+              <w:rPr>
+                <w:rFonts w:ascii="Times New Roman" w:hAnsi="Times New Roman" w:cs="Times New Roman"/>
+                <w:b/>
+                <w:bCs/>
+                <w:sz w:val="22"/>
+                <w:szCs w:val="22"/>
+              </w:rPr>
+              <w:t>responsibility,  and  </w:t>
             </w:r>
           </w:p>
           <w:p>
@@ -2060,47 +1798,7 @@
                 <w:sz w:val="22"/>
                 <w:szCs w:val="22"/>
               </w:rPr>
-              <w:t xml:space="preserve">responsibility </w:t>
-            </w:r>
-            <w:proofErr w:type="gramStart"/>
-            <w:r>
-              <w:rPr>
-                <w:rFonts w:ascii="Times New Roman" w:hAnsi="Times New Roman" w:cs="Times New Roman"/>
-                <w:bCs/>
-                <w:sz w:val="22"/>
-                <w:szCs w:val="22"/>
-              </w:rPr>
-              <w:t>and  professionalism</w:t>
-            </w:r>
-            <w:proofErr w:type="gramEnd"/>
-            <w:r>
-              <w:rPr>
-                <w:rFonts w:ascii="Times New Roman" w:hAnsi="Times New Roman" w:cs="Times New Roman"/>
-                <w:bCs/>
-                <w:sz w:val="22"/>
-                <w:szCs w:val="22"/>
-              </w:rPr>
-              <w:t xml:space="preserve"> in  task </w:t>
-            </w:r>
-            <w:proofErr w:type="spellStart"/>
-            <w:r>
-              <w:rPr>
-                <w:rFonts w:ascii="Times New Roman" w:hAnsi="Times New Roman" w:cs="Times New Roman"/>
-                <w:bCs/>
-                <w:sz w:val="22"/>
-                <w:szCs w:val="22"/>
-              </w:rPr>
-              <w:t>managment</w:t>
-            </w:r>
-            <w:proofErr w:type="spellEnd"/>
-            <w:r>
-              <w:rPr>
-                <w:rFonts w:ascii="Times New Roman" w:hAnsi="Times New Roman" w:cs="Times New Roman"/>
-                <w:bCs/>
-                <w:sz w:val="22"/>
-                <w:szCs w:val="22"/>
-              </w:rPr>
-              <w:t xml:space="preserve">.  Shows </w:t>
+              <w:t xml:space="preserve">responsibility and  professionalism in  task managment.  Shows </w:t>
             </w:r>
             <w:r>
               <w:rPr>
@@ -2199,25 +1897,14 @@
                 <w:szCs w:val="22"/>
               </w:rPr>
             </w:pPr>
-            <w:proofErr w:type="gramStart"/>
-            <w:r>
-              <w:rPr>
-                <w:rFonts w:ascii="Times New Roman" w:hAnsi="Times New Roman" w:cs="Times New Roman"/>
-                <w:bCs/>
-                <w:sz w:val="22"/>
-                <w:szCs w:val="22"/>
-              </w:rPr>
-              <w:t>comprehensive,  well</w:t>
-            </w:r>
-            <w:proofErr w:type="gramEnd"/>
-            <w:r>
-              <w:rPr>
-                <w:rFonts w:ascii="Times New Roman" w:hAnsi="Times New Roman" w:cs="Times New Roman"/>
-                <w:bCs/>
-                <w:sz w:val="22"/>
-                <w:szCs w:val="22"/>
-              </w:rPr>
-              <w:t>-organized  </w:t>
+            <w:r>
+              <w:rPr>
+                <w:rFonts w:ascii="Times New Roman" w:hAnsi="Times New Roman" w:cs="Times New Roman"/>
+                <w:bCs/>
+                <w:sz w:val="22"/>
+                <w:szCs w:val="22"/>
+              </w:rPr>
+              <w:t>comprehensive,  well-organized  </w:t>
             </w:r>
           </w:p>
           <w:p>
@@ -2409,27 +2096,7 @@
                 <w:sz w:val="22"/>
                 <w:szCs w:val="22"/>
               </w:rPr>
-              <w:t xml:space="preserve">responsibility </w:t>
-            </w:r>
-            <w:proofErr w:type="gramStart"/>
-            <w:r>
-              <w:rPr>
-                <w:rFonts w:ascii="Times New Roman" w:hAnsi="Times New Roman" w:cs="Times New Roman"/>
-                <w:bCs/>
-                <w:sz w:val="22"/>
-                <w:szCs w:val="22"/>
-              </w:rPr>
-              <w:t>and  professionalism</w:t>
-            </w:r>
-            <w:proofErr w:type="gramEnd"/>
-            <w:r>
-              <w:rPr>
-                <w:rFonts w:ascii="Times New Roman" w:hAnsi="Times New Roman" w:cs="Times New Roman"/>
-                <w:bCs/>
-                <w:sz w:val="22"/>
-                <w:szCs w:val="22"/>
-              </w:rPr>
-              <w:t>.  Displays  </w:t>
+              <w:t>responsibility and  professionalism.  Displays  </w:t>
             </w:r>
           </w:p>
           <w:p>
@@ -2469,37 +2136,16 @@
                 <w:sz w:val="22"/>
                 <w:szCs w:val="22"/>
               </w:rPr>
-              <w:t xml:space="preserve">commitment </w:t>
-            </w:r>
-            <w:proofErr w:type="gramStart"/>
-            <w:r>
-              <w:rPr>
-                <w:rFonts w:ascii="Times New Roman" w:hAnsi="Times New Roman" w:cs="Times New Roman"/>
-                <w:b/>
-                <w:bCs/>
-                <w:sz w:val="22"/>
-                <w:szCs w:val="22"/>
-              </w:rPr>
-              <w:t xml:space="preserve">to  </w:t>
-            </w:r>
-            <w:r>
-              <w:rPr>
-                <w:rFonts w:ascii="Times New Roman" w:hAnsi="Times New Roman" w:cs="Times New Roman"/>
-                <w:bCs/>
-                <w:sz w:val="22"/>
-                <w:szCs w:val="22"/>
-              </w:rPr>
-              <w:t>quality</w:t>
-            </w:r>
-            <w:proofErr w:type="gramEnd"/>
-            <w:r>
-              <w:rPr>
-                <w:rFonts w:ascii="Times New Roman" w:hAnsi="Times New Roman" w:cs="Times New Roman"/>
-                <w:bCs/>
-                <w:sz w:val="22"/>
-                <w:szCs w:val="22"/>
-              </w:rPr>
-              <w:t xml:space="preserve"> work,  </w:t>
+              <w:t xml:space="preserve">commitment to  </w:t>
+            </w:r>
+            <w:r>
+              <w:rPr>
+                <w:rFonts w:ascii="Times New Roman" w:hAnsi="Times New Roman" w:cs="Times New Roman"/>
+                <w:bCs/>
+                <w:sz w:val="22"/>
+                <w:szCs w:val="22"/>
+              </w:rPr>
+              <w:t>quality work,  </w:t>
             </w:r>
           </w:p>
           <w:p>
@@ -2568,64 +2214,33 @@
               </w:rPr>
               <w:t xml:space="preserve">sufficient thoroughness </w:t>
             </w:r>
-            <w:proofErr w:type="gramStart"/>
-            <w:r>
-              <w:rPr>
-                <w:rFonts w:ascii="Times New Roman" w:hAnsi="Times New Roman" w:cs="Times New Roman"/>
-                <w:bCs/>
-                <w:sz w:val="22"/>
-                <w:szCs w:val="22"/>
-              </w:rPr>
-              <w:t>in  documentation</w:t>
-            </w:r>
-            <w:proofErr w:type="gramEnd"/>
-            <w:r>
-              <w:rPr>
-                <w:rFonts w:ascii="Times New Roman" w:hAnsi="Times New Roman" w:cs="Times New Roman"/>
-                <w:bCs/>
-                <w:sz w:val="22"/>
-                <w:szCs w:val="22"/>
-              </w:rPr>
-              <w:t>,  adhering to  </w:t>
-            </w:r>
-          </w:p>
-          <w:p>
-            <w:pPr>
-              <w:rPr>
-                <w:rFonts w:ascii="Times New Roman" w:hAnsi="Times New Roman" w:cs="Times New Roman"/>
-                <w:bCs/>
-                <w:sz w:val="22"/>
-                <w:szCs w:val="22"/>
-              </w:rPr>
-            </w:pPr>
-            <w:r>
-              <w:rPr>
-                <w:rFonts w:ascii="Times New Roman" w:hAnsi="Times New Roman" w:cs="Times New Roman"/>
-                <w:bCs/>
-                <w:sz w:val="22"/>
-                <w:szCs w:val="22"/>
-              </w:rPr>
-              <w:t xml:space="preserve">guidelines, </w:t>
-            </w:r>
-            <w:proofErr w:type="gramStart"/>
-            <w:r>
-              <w:rPr>
-                <w:rFonts w:ascii="Times New Roman" w:hAnsi="Times New Roman" w:cs="Times New Roman"/>
-                <w:bCs/>
-                <w:sz w:val="22"/>
-                <w:szCs w:val="22"/>
-              </w:rPr>
-              <w:t>with  some</w:t>
-            </w:r>
-            <w:proofErr w:type="gramEnd"/>
-            <w:r>
-              <w:rPr>
-                <w:rFonts w:ascii="Times New Roman" w:hAnsi="Times New Roman" w:cs="Times New Roman"/>
-                <w:bCs/>
-                <w:sz w:val="22"/>
-                <w:szCs w:val="22"/>
-              </w:rPr>
-              <w:t xml:space="preserve"> room for  </w:t>
+            <w:r>
+              <w:rPr>
+                <w:rFonts w:ascii="Times New Roman" w:hAnsi="Times New Roman" w:cs="Times New Roman"/>
+                <w:bCs/>
+                <w:sz w:val="22"/>
+                <w:szCs w:val="22"/>
+              </w:rPr>
+              <w:t>in  documentation,  adhering to  </w:t>
+            </w:r>
+          </w:p>
+          <w:p>
+            <w:pPr>
+              <w:rPr>
+                <w:rFonts w:ascii="Times New Roman" w:hAnsi="Times New Roman" w:cs="Times New Roman"/>
+                <w:bCs/>
+                <w:sz w:val="22"/>
+                <w:szCs w:val="22"/>
+              </w:rPr>
+            </w:pPr>
+            <w:r>
+              <w:rPr>
+                <w:rFonts w:ascii="Times New Roman" w:hAnsi="Times New Roman" w:cs="Times New Roman"/>
+                <w:bCs/>
+                <w:sz w:val="22"/>
+                <w:szCs w:val="22"/>
+              </w:rPr>
+              <w:t>guidelines, with  some room for  </w:t>
             </w:r>
           </w:p>
           <w:p>
@@ -2674,7 +2289,6 @@
                 <w:szCs w:val="22"/>
               </w:rPr>
             </w:pPr>
-            <w:proofErr w:type="gramStart"/>
             <w:r>
               <w:rPr>
                 <w:rFonts w:ascii="Times New Roman" w:hAnsi="Times New Roman" w:cs="Times New Roman"/>
@@ -2692,18 +2306,7 @@
                 <w:sz w:val="22"/>
                 <w:szCs w:val="22"/>
               </w:rPr>
-              <w:t>limited</w:t>
-            </w:r>
-            <w:proofErr w:type="gramEnd"/>
-            <w:r>
-              <w:rPr>
-                <w:rFonts w:ascii="Times New Roman" w:hAnsi="Times New Roman" w:cs="Times New Roman"/>
-                <w:b/>
-                <w:bCs/>
-                <w:sz w:val="22"/>
-                <w:szCs w:val="22"/>
-              </w:rPr>
-              <w:t xml:space="preserve"> effort </w:t>
+              <w:t xml:space="preserve">limited effort </w:t>
             </w:r>
             <w:r>
               <w:rPr>
@@ -2811,25 +2414,14 @@
               </w:rPr>
               <w:t xml:space="preserve">inconsistency </w:t>
             </w:r>
-            <w:proofErr w:type="gramStart"/>
-            <w:r>
-              <w:rPr>
-                <w:rFonts w:ascii="Times New Roman" w:hAnsi="Times New Roman" w:cs="Times New Roman"/>
-                <w:bCs/>
-                <w:sz w:val="22"/>
-                <w:szCs w:val="22"/>
-              </w:rPr>
-              <w:t>in  quality</w:t>
-            </w:r>
-            <w:proofErr w:type="gramEnd"/>
-            <w:r>
-              <w:rPr>
-                <w:rFonts w:ascii="Times New Roman" w:hAnsi="Times New Roman" w:cs="Times New Roman"/>
-                <w:bCs/>
-                <w:sz w:val="22"/>
-                <w:szCs w:val="22"/>
-              </w:rPr>
-              <w:t xml:space="preserve"> work and  shows  </w:t>
+            <w:r>
+              <w:rPr>
+                <w:rFonts w:ascii="Times New Roman" w:hAnsi="Times New Roman" w:cs="Times New Roman"/>
+                <w:bCs/>
+                <w:sz w:val="22"/>
+                <w:szCs w:val="22"/>
+              </w:rPr>
+              <w:t>in  quality work and  shows  </w:t>
             </w:r>
           </w:p>
           <w:p>
@@ -2868,57 +2460,26 @@
                 <w:sz w:val="22"/>
                 <w:szCs w:val="22"/>
               </w:rPr>
-              <w:t xml:space="preserve">thoroughness </w:t>
-            </w:r>
-            <w:proofErr w:type="gramStart"/>
-            <w:r>
-              <w:rPr>
-                <w:rFonts w:ascii="Times New Roman" w:hAnsi="Times New Roman" w:cs="Times New Roman"/>
-                <w:bCs/>
-                <w:sz w:val="22"/>
-                <w:szCs w:val="22"/>
-              </w:rPr>
-              <w:t>or  clarity</w:t>
-            </w:r>
-            <w:proofErr w:type="gramEnd"/>
-            <w:r>
-              <w:rPr>
-                <w:rFonts w:ascii="Times New Roman" w:hAnsi="Times New Roman" w:cs="Times New Roman"/>
-                <w:bCs/>
-                <w:sz w:val="22"/>
-                <w:szCs w:val="22"/>
-              </w:rPr>
-              <w:t xml:space="preserve"> in  </w:t>
-            </w:r>
-          </w:p>
-          <w:p>
-            <w:pPr>
-              <w:rPr>
-                <w:rFonts w:ascii="Times New Roman" w:hAnsi="Times New Roman" w:cs="Times New Roman"/>
-                <w:bCs/>
-                <w:sz w:val="22"/>
-                <w:szCs w:val="22"/>
-              </w:rPr>
-            </w:pPr>
-            <w:proofErr w:type="gramStart"/>
-            <w:r>
-              <w:rPr>
-                <w:rFonts w:ascii="Times New Roman" w:hAnsi="Times New Roman" w:cs="Times New Roman"/>
-                <w:bCs/>
-                <w:sz w:val="22"/>
-                <w:szCs w:val="22"/>
-              </w:rPr>
-              <w:t>documentation,  necessitating</w:t>
-            </w:r>
-            <w:proofErr w:type="gramEnd"/>
-            <w:r>
-              <w:rPr>
-                <w:rFonts w:ascii="Times New Roman" w:hAnsi="Times New Roman" w:cs="Times New Roman"/>
-                <w:bCs/>
-                <w:sz w:val="22"/>
-                <w:szCs w:val="22"/>
-              </w:rPr>
-              <w:t>  </w:t>
+              <w:t>thoroughness or  clarity in  </w:t>
+            </w:r>
+          </w:p>
+          <w:p>
+            <w:pPr>
+              <w:rPr>
+                <w:rFonts w:ascii="Times New Roman" w:hAnsi="Times New Roman" w:cs="Times New Roman"/>
+                <w:bCs/>
+                <w:sz w:val="22"/>
+                <w:szCs w:val="22"/>
+              </w:rPr>
+            </w:pPr>
+            <w:r>
+              <w:rPr>
+                <w:rFonts w:ascii="Times New Roman" w:hAnsi="Times New Roman" w:cs="Times New Roman"/>
+                <w:bCs/>
+                <w:sz w:val="22"/>
+                <w:szCs w:val="22"/>
+              </w:rPr>
+              <w:t>documentation,  necessitating  </w:t>
             </w:r>
           </w:p>
           <w:p>
@@ -2974,38 +2535,17 @@
                 <w:sz w:val="22"/>
                 <w:szCs w:val="22"/>
               </w:rPr>
-              <w:t xml:space="preserve">Demonstrates </w:t>
-            </w:r>
-            <w:proofErr w:type="gramStart"/>
-            <w:r>
-              <w:rPr>
-                <w:rFonts w:ascii="Times New Roman" w:hAnsi="Times New Roman" w:cs="Times New Roman"/>
-                <w:bCs/>
-                <w:sz w:val="22"/>
-                <w:szCs w:val="22"/>
-              </w:rPr>
-              <w:t xml:space="preserve">a  </w:t>
-            </w:r>
-            <w:r>
-              <w:rPr>
-                <w:rFonts w:ascii="Times New Roman" w:hAnsi="Times New Roman" w:cs="Times New Roman"/>
-                <w:b/>
-                <w:bCs/>
-                <w:sz w:val="22"/>
-                <w:szCs w:val="22"/>
-              </w:rPr>
-              <w:t>lack</w:t>
-            </w:r>
-            <w:proofErr w:type="gramEnd"/>
-            <w:r>
-              <w:rPr>
-                <w:rFonts w:ascii="Times New Roman" w:hAnsi="Times New Roman" w:cs="Times New Roman"/>
-                <w:b/>
-                <w:bCs/>
-                <w:sz w:val="22"/>
-                <w:szCs w:val="22"/>
-              </w:rPr>
-              <w:t xml:space="preserve"> </w:t>
+              <w:t xml:space="preserve">Demonstrates a  </w:t>
+            </w:r>
+            <w:r>
+              <w:rPr>
+                <w:rFonts w:ascii="Times New Roman" w:hAnsi="Times New Roman" w:cs="Times New Roman"/>
+                <w:b/>
+                <w:bCs/>
+                <w:sz w:val="22"/>
+                <w:szCs w:val="22"/>
+              </w:rPr>
+              <w:t xml:space="preserve">lack </w:t>
             </w:r>
             <w:r>
               <w:rPr>
@@ -3150,64 +2690,33 @@
                 <w:szCs w:val="22"/>
               </w:rPr>
             </w:pPr>
-            <w:proofErr w:type="gramStart"/>
-            <w:r>
-              <w:rPr>
-                <w:rFonts w:ascii="Times New Roman" w:hAnsi="Times New Roman" w:cs="Times New Roman"/>
-                <w:bCs/>
-                <w:sz w:val="22"/>
-                <w:szCs w:val="22"/>
-              </w:rPr>
-              <w:t>Documentation  is</w:t>
-            </w:r>
-            <w:proofErr w:type="gramEnd"/>
-            <w:r>
-              <w:rPr>
-                <w:rFonts w:ascii="Times New Roman" w:hAnsi="Times New Roman" w:cs="Times New Roman"/>
-                <w:bCs/>
-                <w:sz w:val="22"/>
-                <w:szCs w:val="22"/>
-              </w:rPr>
-              <w:t xml:space="preserve"> incomplete,  </w:t>
-            </w:r>
-          </w:p>
-          <w:p>
-            <w:pPr>
-              <w:rPr>
-                <w:rFonts w:ascii="Times New Roman" w:hAnsi="Times New Roman" w:cs="Times New Roman"/>
-                <w:bCs/>
-                <w:sz w:val="22"/>
-                <w:szCs w:val="22"/>
-              </w:rPr>
-            </w:pPr>
-            <w:r>
-              <w:rPr>
-                <w:rFonts w:ascii="Times New Roman" w:hAnsi="Times New Roman" w:cs="Times New Roman"/>
-                <w:bCs/>
-                <w:sz w:val="22"/>
-                <w:szCs w:val="22"/>
-              </w:rPr>
-              <w:t xml:space="preserve">disorganized, </w:t>
-            </w:r>
-            <w:proofErr w:type="gramStart"/>
-            <w:r>
-              <w:rPr>
-                <w:rFonts w:ascii="Times New Roman" w:hAnsi="Times New Roman" w:cs="Times New Roman"/>
-                <w:bCs/>
-                <w:sz w:val="22"/>
-                <w:szCs w:val="22"/>
-              </w:rPr>
-              <w:t>or  unclear</w:t>
-            </w:r>
-            <w:proofErr w:type="gramEnd"/>
-            <w:r>
-              <w:rPr>
-                <w:rFonts w:ascii="Times New Roman" w:hAnsi="Times New Roman" w:cs="Times New Roman"/>
-                <w:bCs/>
-                <w:sz w:val="22"/>
-                <w:szCs w:val="22"/>
-              </w:rPr>
-              <w:t>.</w:t>
+            <w:r>
+              <w:rPr>
+                <w:rFonts w:ascii="Times New Roman" w:hAnsi="Times New Roman" w:cs="Times New Roman"/>
+                <w:bCs/>
+                <w:sz w:val="22"/>
+                <w:szCs w:val="22"/>
+              </w:rPr>
+              <w:t>Documentation  is incomplete,  </w:t>
+            </w:r>
+          </w:p>
+          <w:p>
+            <w:pPr>
+              <w:rPr>
+                <w:rFonts w:ascii="Times New Roman" w:hAnsi="Times New Roman" w:cs="Times New Roman"/>
+                <w:bCs/>
+                <w:sz w:val="22"/>
+                <w:szCs w:val="22"/>
+              </w:rPr>
+            </w:pPr>
+            <w:r>
+              <w:rPr>
+                <w:rFonts w:ascii="Times New Roman" w:hAnsi="Times New Roman" w:cs="Times New Roman"/>
+                <w:bCs/>
+                <w:sz w:val="22"/>
+                <w:szCs w:val="22"/>
+              </w:rPr>
+              <w:t>disorganized, or  unclear.</w:t>
             </w:r>
           </w:p>
         </w:tc>
@@ -3278,29 +2787,8 @@
                 <w:sz w:val="22"/>
                 <w:szCs w:val="22"/>
               </w:rPr>
-              <w:t xml:space="preserve">Ability to </w:t>
-            </w:r>
-            <w:proofErr w:type="gramStart"/>
-            <w:r>
-              <w:rPr>
-                <w:rFonts w:ascii="Times New Roman" w:hAnsi="Times New Roman" w:cs="Times New Roman"/>
-                <w:b/>
-                <w:bCs/>
-                <w:sz w:val="22"/>
-                <w:szCs w:val="22"/>
-              </w:rPr>
-              <w:t>apply  techniques</w:t>
-            </w:r>
-            <w:proofErr w:type="gramEnd"/>
-            <w:r>
-              <w:rPr>
-                <w:rFonts w:ascii="Times New Roman" w:hAnsi="Times New Roman" w:cs="Times New Roman"/>
-                <w:b/>
-                <w:bCs/>
-                <w:sz w:val="22"/>
-                <w:szCs w:val="22"/>
-              </w:rPr>
-              <w:t>,  </w:t>
+              <w:lastRenderedPageBreak/>
+              <w:t>Ability to apply  techniques,  </w:t>
             </w:r>
           </w:p>
           <w:p>
@@ -3397,38 +2885,17 @@
                 <w:sz w:val="22"/>
                 <w:szCs w:val="22"/>
               </w:rPr>
-              <w:t xml:space="preserve">Executes lab </w:t>
-            </w:r>
-            <w:proofErr w:type="gramStart"/>
-            <w:r>
-              <w:rPr>
-                <w:rFonts w:ascii="Times New Roman" w:hAnsi="Times New Roman" w:cs="Times New Roman"/>
-                <w:bCs/>
-                <w:sz w:val="22"/>
-                <w:szCs w:val="22"/>
-              </w:rPr>
-              <w:t xml:space="preserve">tasks  </w:t>
-            </w:r>
-            <w:r>
-              <w:rPr>
-                <w:rFonts w:ascii="Times New Roman" w:hAnsi="Times New Roman" w:cs="Times New Roman"/>
-                <w:b/>
-                <w:bCs/>
-                <w:sz w:val="22"/>
-                <w:szCs w:val="22"/>
-              </w:rPr>
-              <w:t>with</w:t>
-            </w:r>
-            <w:proofErr w:type="gramEnd"/>
-            <w:r>
-              <w:rPr>
-                <w:rFonts w:ascii="Times New Roman" w:hAnsi="Times New Roman" w:cs="Times New Roman"/>
-                <w:b/>
-                <w:bCs/>
-                <w:sz w:val="22"/>
-                <w:szCs w:val="22"/>
-              </w:rPr>
-              <w:t xml:space="preserve"> exceptional  skill </w:t>
+              <w:t xml:space="preserve">Executes lab tasks  </w:t>
+            </w:r>
+            <w:r>
+              <w:rPr>
+                <w:rFonts w:ascii="Times New Roman" w:hAnsi="Times New Roman" w:cs="Times New Roman"/>
+                <w:b/>
+                <w:bCs/>
+                <w:sz w:val="22"/>
+                <w:szCs w:val="22"/>
+              </w:rPr>
+              <w:t xml:space="preserve">with exceptional  skill </w:t>
             </w:r>
             <w:r>
               <w:rPr>
@@ -3541,38 +3008,17 @@
                 <w:sz w:val="22"/>
                 <w:szCs w:val="22"/>
               </w:rPr>
-              <w:t xml:space="preserve">Executes lab </w:t>
-            </w:r>
-            <w:proofErr w:type="gramStart"/>
-            <w:r>
-              <w:rPr>
-                <w:rFonts w:ascii="Times New Roman" w:hAnsi="Times New Roman" w:cs="Times New Roman"/>
-                <w:bCs/>
-                <w:sz w:val="22"/>
-                <w:szCs w:val="22"/>
-              </w:rPr>
-              <w:t xml:space="preserve">tasks  </w:t>
-            </w:r>
-            <w:r>
-              <w:rPr>
-                <w:rFonts w:ascii="Times New Roman" w:hAnsi="Times New Roman" w:cs="Times New Roman"/>
-                <w:b/>
-                <w:bCs/>
-                <w:sz w:val="22"/>
-                <w:szCs w:val="22"/>
-              </w:rPr>
-              <w:t>with</w:t>
-            </w:r>
-            <w:proofErr w:type="gramEnd"/>
-            <w:r>
-              <w:rPr>
-                <w:rFonts w:ascii="Times New Roman" w:hAnsi="Times New Roman" w:cs="Times New Roman"/>
-                <w:b/>
-                <w:bCs/>
-                <w:sz w:val="22"/>
-                <w:szCs w:val="22"/>
-              </w:rPr>
-              <w:t xml:space="preserve"> adequate  skill </w:t>
+              <w:t xml:space="preserve">Executes lab tasks  </w:t>
+            </w:r>
+            <w:r>
+              <w:rPr>
+                <w:rFonts w:ascii="Times New Roman" w:hAnsi="Times New Roman" w:cs="Times New Roman"/>
+                <w:b/>
+                <w:bCs/>
+                <w:sz w:val="22"/>
+                <w:szCs w:val="22"/>
+              </w:rPr>
+              <w:t xml:space="preserve">with adequate  skill </w:t>
             </w:r>
             <w:r>
               <w:rPr>
@@ -3600,27 +3046,7 @@
                 <w:sz w:val="22"/>
                 <w:szCs w:val="22"/>
               </w:rPr>
-              <w:t>design/</w:t>
-            </w:r>
-            <w:proofErr w:type="gramStart"/>
-            <w:r>
-              <w:rPr>
-                <w:rFonts w:ascii="Times New Roman" w:hAnsi="Times New Roman" w:cs="Times New Roman"/>
-                <w:bCs/>
-                <w:sz w:val="22"/>
-                <w:szCs w:val="22"/>
-              </w:rPr>
-              <w:t>develop  solution</w:t>
-            </w:r>
-            <w:proofErr w:type="gramEnd"/>
-            <w:r>
-              <w:rPr>
-                <w:rFonts w:ascii="Times New Roman" w:hAnsi="Times New Roman" w:cs="Times New Roman"/>
-                <w:bCs/>
-                <w:sz w:val="22"/>
-                <w:szCs w:val="22"/>
-              </w:rPr>
-              <w:t xml:space="preserve"> and  </w:t>
+              <w:t>design/develop  solution and  </w:t>
             </w:r>
           </w:p>
           <w:p>
@@ -3669,27 +3095,7 @@
                 <w:sz w:val="22"/>
                 <w:szCs w:val="22"/>
               </w:rPr>
-              <w:t xml:space="preserve">in </w:t>
-            </w:r>
-            <w:proofErr w:type="gramStart"/>
-            <w:r>
-              <w:rPr>
-                <w:rFonts w:ascii="Times New Roman" w:hAnsi="Times New Roman" w:cs="Times New Roman"/>
-                <w:bCs/>
-                <w:sz w:val="22"/>
-                <w:szCs w:val="22"/>
-              </w:rPr>
-              <w:t>lab  techniques</w:t>
-            </w:r>
-            <w:proofErr w:type="gramEnd"/>
-            <w:r>
-              <w:rPr>
-                <w:rFonts w:ascii="Times New Roman" w:hAnsi="Times New Roman" w:cs="Times New Roman"/>
-                <w:bCs/>
-                <w:sz w:val="22"/>
-                <w:szCs w:val="22"/>
-              </w:rPr>
-              <w:t xml:space="preserve"> and  procedures.</w:t>
+              <w:t>in lab  techniques and  procedures.</w:t>
             </w:r>
           </w:p>
         </w:tc>
@@ -3777,67 +3183,34 @@
               </w:rPr>
               <w:t xml:space="preserve">minimal skill </w:t>
             </w:r>
-            <w:proofErr w:type="gramStart"/>
-            <w:r>
-              <w:rPr>
-                <w:rFonts w:ascii="Times New Roman" w:hAnsi="Times New Roman" w:cs="Times New Roman"/>
-                <w:bCs/>
-                <w:sz w:val="22"/>
-                <w:szCs w:val="22"/>
-              </w:rPr>
-              <w:t>to  design</w:t>
-            </w:r>
-            <w:proofErr w:type="gramEnd"/>
-            <w:r>
-              <w:rPr>
-                <w:rFonts w:ascii="Times New Roman" w:hAnsi="Times New Roman" w:cs="Times New Roman"/>
-                <w:bCs/>
-                <w:sz w:val="22"/>
-                <w:szCs w:val="22"/>
-              </w:rPr>
-              <w:t>/develop  solution and  </w:t>
-            </w:r>
-          </w:p>
-          <w:p>
-            <w:pPr>
-              <w:rPr>
-                <w:rFonts w:ascii="Times New Roman" w:hAnsi="Times New Roman" w:cs="Times New Roman"/>
-                <w:bCs/>
-                <w:sz w:val="22"/>
-                <w:szCs w:val="22"/>
-              </w:rPr>
-            </w:pPr>
-            <w:r>
-              <w:rPr>
-                <w:rFonts w:ascii="Times New Roman" w:hAnsi="Times New Roman" w:cs="Times New Roman"/>
-                <w:b/>
-                <w:bCs/>
-                <w:sz w:val="22"/>
-                <w:szCs w:val="22"/>
-              </w:rPr>
-              <w:t xml:space="preserve">shows </w:t>
-            </w:r>
-            <w:proofErr w:type="spellStart"/>
-            <w:r>
-              <w:rPr>
-                <w:rFonts w:ascii="Times New Roman" w:hAnsi="Times New Roman" w:cs="Times New Roman"/>
-                <w:b/>
-                <w:bCs/>
-                <w:sz w:val="22"/>
-                <w:szCs w:val="22"/>
-              </w:rPr>
-              <w:t>modeate</w:t>
-            </w:r>
-            <w:proofErr w:type="spellEnd"/>
-            <w:r>
-              <w:rPr>
-                <w:rFonts w:ascii="Times New Roman" w:hAnsi="Times New Roman" w:cs="Times New Roman"/>
-                <w:b/>
-                <w:bCs/>
-                <w:sz w:val="22"/>
-                <w:szCs w:val="22"/>
-              </w:rPr>
-              <w:t xml:space="preserve"> proficiency </w:t>
+            <w:r>
+              <w:rPr>
+                <w:rFonts w:ascii="Times New Roman" w:hAnsi="Times New Roman" w:cs="Times New Roman"/>
+                <w:bCs/>
+                <w:sz w:val="22"/>
+                <w:szCs w:val="22"/>
+              </w:rPr>
+              <w:t>to  design/develop  solution and  </w:t>
+            </w:r>
+          </w:p>
+          <w:p>
+            <w:pPr>
+              <w:rPr>
+                <w:rFonts w:ascii="Times New Roman" w:hAnsi="Times New Roman" w:cs="Times New Roman"/>
+                <w:bCs/>
+                <w:sz w:val="22"/>
+                <w:szCs w:val="22"/>
+              </w:rPr>
+            </w:pPr>
+            <w:r>
+              <w:rPr>
+                <w:rFonts w:ascii="Times New Roman" w:hAnsi="Times New Roman" w:cs="Times New Roman"/>
+                <w:b/>
+                <w:bCs/>
+                <w:sz w:val="22"/>
+                <w:szCs w:val="22"/>
+              </w:rPr>
+              <w:t xml:space="preserve">shows modeate proficiency </w:t>
             </w:r>
             <w:r>
               <w:rPr>
@@ -3953,25 +3326,14 @@
               </w:rPr>
               <w:t xml:space="preserve">limited skill </w:t>
             </w:r>
-            <w:proofErr w:type="gramStart"/>
-            <w:r>
-              <w:rPr>
-                <w:rFonts w:ascii="Times New Roman" w:hAnsi="Times New Roman" w:cs="Times New Roman"/>
-                <w:bCs/>
-                <w:sz w:val="22"/>
-                <w:szCs w:val="22"/>
-              </w:rPr>
-              <w:t>to  design</w:t>
-            </w:r>
-            <w:proofErr w:type="gramEnd"/>
-            <w:r>
-              <w:rPr>
-                <w:rFonts w:ascii="Times New Roman" w:hAnsi="Times New Roman" w:cs="Times New Roman"/>
-                <w:bCs/>
-                <w:sz w:val="22"/>
-                <w:szCs w:val="22"/>
-              </w:rPr>
-              <w:t>/develop  solution and  </w:t>
+            <w:r>
+              <w:rPr>
+                <w:rFonts w:ascii="Times New Roman" w:hAnsi="Times New Roman" w:cs="Times New Roman"/>
+                <w:bCs/>
+                <w:sz w:val="22"/>
+                <w:szCs w:val="22"/>
+              </w:rPr>
+              <w:t>to  design/develop  solution and  </w:t>
             </w:r>
           </w:p>
           <w:p>
@@ -4110,7 +3472,6 @@
                 <w:sz w:val="22"/>
                 <w:szCs w:val="22"/>
               </w:rPr>
-              <w:lastRenderedPageBreak/>
               <w:t>Demonstrate  </w:t>
             </w:r>
           </w:p>
@@ -4123,27 +3484,15 @@
                 <w:szCs w:val="22"/>
               </w:rPr>
             </w:pPr>
-            <w:proofErr w:type="gramStart"/>
-            <w:r>
-              <w:rPr>
-                <w:rFonts w:ascii="Times New Roman" w:hAnsi="Times New Roman" w:cs="Times New Roman"/>
-                <w:b/>
-                <w:bCs/>
-                <w:sz w:val="22"/>
-                <w:szCs w:val="22"/>
-              </w:rPr>
-              <w:t>understanding  and</w:t>
-            </w:r>
-            <w:proofErr w:type="gramEnd"/>
-            <w:r>
-              <w:rPr>
-                <w:rFonts w:ascii="Times New Roman" w:hAnsi="Times New Roman" w:cs="Times New Roman"/>
-                <w:b/>
-                <w:bCs/>
-                <w:sz w:val="22"/>
-                <w:szCs w:val="22"/>
-              </w:rPr>
-              <w:t xml:space="preserve"> relevant  </w:t>
+            <w:r>
+              <w:rPr>
+                <w:rFonts w:ascii="Times New Roman" w:hAnsi="Times New Roman" w:cs="Times New Roman"/>
+                <w:b/>
+                <w:bCs/>
+                <w:sz w:val="22"/>
+                <w:szCs w:val="22"/>
+              </w:rPr>
+              <w:t>understanding  and relevant  </w:t>
             </w:r>
           </w:p>
           <w:p>
@@ -4287,27 +3636,7 @@
                 <w:sz w:val="22"/>
                 <w:szCs w:val="22"/>
               </w:rPr>
-              <w:t xml:space="preserve">and analysis of </w:t>
-            </w:r>
-            <w:proofErr w:type="gramStart"/>
-            <w:r>
-              <w:rPr>
-                <w:rFonts w:ascii="Times New Roman" w:hAnsi="Times New Roman" w:cs="Times New Roman"/>
-                <w:bCs/>
-                <w:sz w:val="22"/>
-                <w:szCs w:val="22"/>
-              </w:rPr>
-              <w:t>the  objectives</w:t>
-            </w:r>
-            <w:proofErr w:type="gramEnd"/>
-            <w:r>
-              <w:rPr>
-                <w:rFonts w:ascii="Times New Roman" w:hAnsi="Times New Roman" w:cs="Times New Roman"/>
-                <w:bCs/>
-                <w:sz w:val="22"/>
-                <w:szCs w:val="22"/>
-              </w:rPr>
-              <w:t xml:space="preserve"> and  </w:t>
+              <w:t>and analysis of the  objectives and  </w:t>
             </w:r>
           </w:p>
           <w:p>
@@ -4363,77 +3692,36 @@
                 <w:sz w:val="22"/>
                 <w:szCs w:val="22"/>
               </w:rPr>
-              <w:t xml:space="preserve">Demonstrates </w:t>
-            </w:r>
-            <w:proofErr w:type="gramStart"/>
-            <w:r>
-              <w:rPr>
-                <w:rFonts w:ascii="Times New Roman" w:hAnsi="Times New Roman" w:cs="Times New Roman"/>
-                <w:bCs/>
-                <w:sz w:val="22"/>
-                <w:szCs w:val="22"/>
-              </w:rPr>
-              <w:t xml:space="preserve">a  </w:t>
-            </w:r>
-            <w:r>
-              <w:rPr>
-                <w:rFonts w:ascii="Times New Roman" w:hAnsi="Times New Roman" w:cs="Times New Roman"/>
-                <w:b/>
-                <w:bCs/>
-                <w:sz w:val="22"/>
-                <w:szCs w:val="22"/>
-              </w:rPr>
-              <w:t>good</w:t>
-            </w:r>
-            <w:proofErr w:type="gramEnd"/>
-            <w:r>
-              <w:rPr>
-                <w:rFonts w:ascii="Times New Roman" w:hAnsi="Times New Roman" w:cs="Times New Roman"/>
-                <w:b/>
-                <w:bCs/>
-                <w:sz w:val="22"/>
-                <w:szCs w:val="22"/>
-              </w:rPr>
-              <w:t> </w:t>
-            </w:r>
-          </w:p>
-          <w:p>
-            <w:pPr>
-              <w:rPr>
-                <w:rFonts w:ascii="Times New Roman" w:hAnsi="Times New Roman" w:cs="Times New Roman"/>
-                <w:bCs/>
-                <w:sz w:val="22"/>
-                <w:szCs w:val="22"/>
-              </w:rPr>
-            </w:pPr>
-            <w:r>
-              <w:rPr>
-                <w:rFonts w:ascii="Times New Roman" w:hAnsi="Times New Roman" w:cs="Times New Roman"/>
-                <w:bCs/>
-                <w:sz w:val="22"/>
-                <w:szCs w:val="22"/>
-              </w:rPr>
-              <w:t xml:space="preserve">understanding </w:t>
-            </w:r>
-            <w:proofErr w:type="gramStart"/>
-            <w:r>
-              <w:rPr>
-                <w:rFonts w:ascii="Times New Roman" w:hAnsi="Times New Roman" w:cs="Times New Roman"/>
-                <w:bCs/>
-                <w:sz w:val="22"/>
-                <w:szCs w:val="22"/>
-              </w:rPr>
-              <w:t>of  concepts</w:t>
-            </w:r>
-            <w:proofErr w:type="gramEnd"/>
-            <w:r>
-              <w:rPr>
-                <w:rFonts w:ascii="Times New Roman" w:hAnsi="Times New Roman" w:cs="Times New Roman"/>
-                <w:bCs/>
-                <w:sz w:val="22"/>
-                <w:szCs w:val="22"/>
-              </w:rPr>
-              <w:t xml:space="preserve"> with  </w:t>
+              <w:t xml:space="preserve">Demonstrates a  </w:t>
+            </w:r>
+            <w:r>
+              <w:rPr>
+                <w:rFonts w:ascii="Times New Roman" w:hAnsi="Times New Roman" w:cs="Times New Roman"/>
+                <w:b/>
+                <w:bCs/>
+                <w:sz w:val="22"/>
+                <w:szCs w:val="22"/>
+              </w:rPr>
+              <w:t>good </w:t>
+            </w:r>
+          </w:p>
+          <w:p>
+            <w:pPr>
+              <w:rPr>
+                <w:rFonts w:ascii="Times New Roman" w:hAnsi="Times New Roman" w:cs="Times New Roman"/>
+                <w:bCs/>
+                <w:sz w:val="22"/>
+                <w:szCs w:val="22"/>
+              </w:rPr>
+            </w:pPr>
+            <w:r>
+              <w:rPr>
+                <w:rFonts w:ascii="Times New Roman" w:hAnsi="Times New Roman" w:cs="Times New Roman"/>
+                <w:bCs/>
+                <w:sz w:val="22"/>
+                <w:szCs w:val="22"/>
+              </w:rPr>
+              <w:t>understanding of  concepts with  </w:t>
             </w:r>
           </w:p>
           <w:p>
@@ -4475,25 +3763,14 @@
               </w:rPr>
               <w:t xml:space="preserve">explanations </w:t>
             </w:r>
-            <w:proofErr w:type="gramStart"/>
-            <w:r>
-              <w:rPr>
-                <w:rFonts w:ascii="Times New Roman" w:hAnsi="Times New Roman" w:cs="Times New Roman"/>
-                <w:bCs/>
-                <w:sz w:val="22"/>
-                <w:szCs w:val="22"/>
-              </w:rPr>
-              <w:t>of  investigation</w:t>
-            </w:r>
-            <w:proofErr w:type="gramEnd"/>
-            <w:r>
-              <w:rPr>
-                <w:rFonts w:ascii="Times New Roman" w:hAnsi="Times New Roman" w:cs="Times New Roman"/>
-                <w:bCs/>
-                <w:sz w:val="22"/>
-                <w:szCs w:val="22"/>
-              </w:rPr>
-              <w:t xml:space="preserve"> and  analysis that align  with the lab's  </w:t>
+            <w:r>
+              <w:rPr>
+                <w:rFonts w:ascii="Times New Roman" w:hAnsi="Times New Roman" w:cs="Times New Roman"/>
+                <w:bCs/>
+                <w:sz w:val="22"/>
+                <w:szCs w:val="22"/>
+              </w:rPr>
+              <w:t>of  investigation and  analysis that align  with the lab's  </w:t>
             </w:r>
           </w:p>
           <w:p>
@@ -4568,68 +3845,36 @@
                 <w:sz w:val="22"/>
                 <w:szCs w:val="22"/>
               </w:rPr>
-              <w:t xml:space="preserve">Demonstrates </w:t>
-            </w:r>
-            <w:proofErr w:type="gramStart"/>
-            <w:r>
-              <w:rPr>
-                <w:rFonts w:ascii="Times New Roman" w:hAnsi="Times New Roman" w:cs="Times New Roman"/>
-                <w:bCs/>
-                <w:sz w:val="22"/>
-                <w:szCs w:val="22"/>
-              </w:rPr>
-              <w:t xml:space="preserve">a  </w:t>
-            </w:r>
-            <w:r>
-              <w:rPr>
-                <w:rFonts w:ascii="Times New Roman" w:hAnsi="Times New Roman" w:cs="Times New Roman"/>
-                <w:b/>
-                <w:bCs/>
-                <w:sz w:val="22"/>
-                <w:szCs w:val="22"/>
-              </w:rPr>
-              <w:t>basic</w:t>
-            </w:r>
-            <w:proofErr w:type="gramEnd"/>
-            <w:r>
-              <w:rPr>
-                <w:rFonts w:ascii="Times New Roman" w:hAnsi="Times New Roman" w:cs="Times New Roman"/>
-                <w:b/>
-                <w:bCs/>
-                <w:sz w:val="22"/>
-                <w:szCs w:val="22"/>
-              </w:rPr>
-              <w:t> </w:t>
-            </w:r>
-          </w:p>
-          <w:p>
-            <w:pPr>
-              <w:rPr>
-                <w:rFonts w:ascii="Times New Roman" w:hAnsi="Times New Roman" w:cs="Times New Roman"/>
-                <w:bCs/>
-                <w:sz w:val="22"/>
-                <w:szCs w:val="22"/>
-              </w:rPr>
-            </w:pPr>
-            <w:proofErr w:type="gramStart"/>
-            <w:r>
-              <w:rPr>
-                <w:rFonts w:ascii="Times New Roman" w:hAnsi="Times New Roman" w:cs="Times New Roman"/>
-                <w:bCs/>
-                <w:sz w:val="22"/>
-                <w:szCs w:val="22"/>
-              </w:rPr>
-              <w:t>understanding  of</w:t>
-            </w:r>
-            <w:proofErr w:type="gramEnd"/>
-            <w:r>
-              <w:rPr>
-                <w:rFonts w:ascii="Times New Roman" w:hAnsi="Times New Roman" w:cs="Times New Roman"/>
-                <w:bCs/>
-                <w:sz w:val="22"/>
-                <w:szCs w:val="22"/>
-              </w:rPr>
-              <w:t xml:space="preserve"> key concepts  but </w:t>
+              <w:t xml:space="preserve">Demonstrates a  </w:t>
+            </w:r>
+            <w:r>
+              <w:rPr>
+                <w:rFonts w:ascii="Times New Roman" w:hAnsi="Times New Roman" w:cs="Times New Roman"/>
+                <w:b/>
+                <w:bCs/>
+                <w:sz w:val="22"/>
+                <w:szCs w:val="22"/>
+              </w:rPr>
+              <w:t>basic </w:t>
+            </w:r>
+          </w:p>
+          <w:p>
+            <w:pPr>
+              <w:rPr>
+                <w:rFonts w:ascii="Times New Roman" w:hAnsi="Times New Roman" w:cs="Times New Roman"/>
+                <w:bCs/>
+                <w:sz w:val="22"/>
+                <w:szCs w:val="22"/>
+              </w:rPr>
+            </w:pPr>
+            <w:r>
+              <w:rPr>
+                <w:rFonts w:ascii="Times New Roman" w:hAnsi="Times New Roman" w:cs="Times New Roman"/>
+                <w:bCs/>
+                <w:sz w:val="22"/>
+                <w:szCs w:val="22"/>
+              </w:rPr>
+              <w:t xml:space="preserve">understanding  of key concepts  but </w:t>
             </w:r>
             <w:r>
               <w:rPr>
@@ -4755,7 +4000,6 @@
                 <w:szCs w:val="22"/>
               </w:rPr>
             </w:pPr>
-            <w:proofErr w:type="gramStart"/>
             <w:r>
               <w:rPr>
                 <w:rFonts w:ascii="Times New Roman" w:hAnsi="Times New Roman" w:cs="Times New Roman"/>
@@ -4773,18 +4017,7 @@
                 <w:sz w:val="22"/>
                 <w:szCs w:val="22"/>
               </w:rPr>
-              <w:t>limited</w:t>
-            </w:r>
-            <w:proofErr w:type="gramEnd"/>
-            <w:r>
-              <w:rPr>
-                <w:rFonts w:ascii="Times New Roman" w:hAnsi="Times New Roman" w:cs="Times New Roman"/>
-                <w:b/>
-                <w:bCs/>
-                <w:sz w:val="22"/>
-                <w:szCs w:val="22"/>
-              </w:rPr>
-              <w:t> </w:t>
+              <w:t>limited </w:t>
             </w:r>
           </w:p>
           <w:p>
@@ -4822,38 +4055,17 @@
                 <w:sz w:val="22"/>
                 <w:szCs w:val="22"/>
               </w:rPr>
-              <w:t xml:space="preserve">of concepts </w:t>
-            </w:r>
-            <w:proofErr w:type="gramStart"/>
-            <w:r>
-              <w:rPr>
-                <w:rFonts w:ascii="Times New Roman" w:hAnsi="Times New Roman" w:cs="Times New Roman"/>
-                <w:bCs/>
-                <w:sz w:val="22"/>
-                <w:szCs w:val="22"/>
-              </w:rPr>
-              <w:t xml:space="preserve">with  </w:t>
-            </w:r>
-            <w:r>
-              <w:rPr>
-                <w:rFonts w:ascii="Times New Roman" w:hAnsi="Times New Roman" w:cs="Times New Roman"/>
-                <w:b/>
-                <w:bCs/>
-                <w:sz w:val="22"/>
-                <w:szCs w:val="22"/>
-              </w:rPr>
-              <w:t>unclear</w:t>
-            </w:r>
-            <w:proofErr w:type="gramEnd"/>
-            <w:r>
-              <w:rPr>
-                <w:rFonts w:ascii="Times New Roman" w:hAnsi="Times New Roman" w:cs="Times New Roman"/>
-                <w:b/>
-                <w:bCs/>
-                <w:sz w:val="22"/>
-                <w:szCs w:val="22"/>
-              </w:rPr>
-              <w:t> </w:t>
+              <w:t xml:space="preserve">of concepts with  </w:t>
+            </w:r>
+            <w:r>
+              <w:rPr>
+                <w:rFonts w:ascii="Times New Roman" w:hAnsi="Times New Roman" w:cs="Times New Roman"/>
+                <w:b/>
+                <w:bCs/>
+                <w:sz w:val="22"/>
+                <w:szCs w:val="22"/>
+              </w:rPr>
+              <w:t>unclear </w:t>
             </w:r>
           </w:p>
           <w:p>
@@ -4875,25 +4087,14 @@
               </w:rPr>
               <w:t xml:space="preserve">explanations </w:t>
             </w:r>
-            <w:proofErr w:type="gramStart"/>
-            <w:r>
-              <w:rPr>
-                <w:rFonts w:ascii="Times New Roman" w:hAnsi="Times New Roman" w:cs="Times New Roman"/>
-                <w:bCs/>
-                <w:sz w:val="22"/>
-                <w:szCs w:val="22"/>
-              </w:rPr>
-              <w:t>of  investigation</w:t>
-            </w:r>
-            <w:proofErr w:type="gramEnd"/>
-            <w:r>
-              <w:rPr>
-                <w:rFonts w:ascii="Times New Roman" w:hAnsi="Times New Roman" w:cs="Times New Roman"/>
-                <w:bCs/>
-                <w:sz w:val="22"/>
-                <w:szCs w:val="22"/>
-              </w:rPr>
-              <w:t>  </w:t>
+            <w:r>
+              <w:rPr>
+                <w:rFonts w:ascii="Times New Roman" w:hAnsi="Times New Roman" w:cs="Times New Roman"/>
+                <w:bCs/>
+                <w:sz w:val="22"/>
+                <w:szCs w:val="22"/>
+              </w:rPr>
+              <w:t>of  investigation  </w:t>
             </w:r>
           </w:p>
           <w:p>
@@ -4931,66 +4132,26 @@
                 <w:sz w:val="22"/>
                 <w:szCs w:val="22"/>
               </w:rPr>
-              <w:t xml:space="preserve">that do not </w:t>
-            </w:r>
-            <w:proofErr w:type="gramStart"/>
-            <w:r>
-              <w:rPr>
-                <w:rFonts w:ascii="Times New Roman" w:hAnsi="Times New Roman" w:cs="Times New Roman"/>
-                <w:bCs/>
-                <w:sz w:val="22"/>
-                <w:szCs w:val="22"/>
-              </w:rPr>
-              <w:t>align  with</w:t>
-            </w:r>
-            <w:proofErr w:type="gramEnd"/>
-            <w:r>
-              <w:rPr>
-                <w:rFonts w:ascii="Times New Roman" w:hAnsi="Times New Roman" w:cs="Times New Roman"/>
-                <w:bCs/>
-                <w:sz w:val="22"/>
-                <w:szCs w:val="22"/>
-              </w:rPr>
-              <w:t xml:space="preserve"> the lab’s </w:t>
-            </w:r>
-          </w:p>
-          <w:p>
-            <w:pPr>
-              <w:rPr>
-                <w:rFonts w:ascii="Times New Roman" w:hAnsi="Times New Roman" w:cs="Times New Roman"/>
-                <w:bCs/>
-                <w:sz w:val="22"/>
-                <w:szCs w:val="22"/>
-              </w:rPr>
-            </w:pPr>
-            <w:r>
-              <w:rPr>
-                <w:rFonts w:ascii="Times New Roman" w:hAnsi="Times New Roman" w:cs="Times New Roman"/>
-                <w:bCs/>
-                <w:sz w:val="22"/>
-                <w:szCs w:val="22"/>
-              </w:rPr>
-              <w:t xml:space="preserve">objectives </w:t>
-            </w:r>
-            <w:proofErr w:type="gramStart"/>
-            <w:r>
-              <w:rPr>
-                <w:rFonts w:ascii="Times New Roman" w:hAnsi="Times New Roman" w:cs="Times New Roman"/>
-                <w:bCs/>
-                <w:sz w:val="22"/>
-                <w:szCs w:val="22"/>
-              </w:rPr>
-              <w:t>and  outcomes</w:t>
-            </w:r>
-            <w:proofErr w:type="gramEnd"/>
-            <w:r>
-              <w:rPr>
-                <w:rFonts w:ascii="Times New Roman" w:hAnsi="Times New Roman" w:cs="Times New Roman"/>
-                <w:bCs/>
-                <w:sz w:val="22"/>
-                <w:szCs w:val="22"/>
-              </w:rPr>
-              <w:t>.</w:t>
+              <w:t>that do not align  with the lab’s </w:t>
+            </w:r>
+          </w:p>
+          <w:p>
+            <w:pPr>
+              <w:rPr>
+                <w:rFonts w:ascii="Times New Roman" w:hAnsi="Times New Roman" w:cs="Times New Roman"/>
+                <w:bCs/>
+                <w:sz w:val="22"/>
+                <w:szCs w:val="22"/>
+              </w:rPr>
+            </w:pPr>
+            <w:r>
+              <w:rPr>
+                <w:rFonts w:ascii="Times New Roman" w:hAnsi="Times New Roman" w:cs="Times New Roman"/>
+                <w:bCs/>
+                <w:sz w:val="22"/>
+                <w:szCs w:val="22"/>
+              </w:rPr>
+              <w:t>objectives and  outcomes.</w:t>
             </w:r>
           </w:p>
         </w:tc>
@@ -5456,6 +4617,7 @@
   <w:style w:type="character" w:default="1" w:styleId="DefaultParagraphFont">
     <w:name w:val="Default Paragraph Font"/>
     <w:uiPriority w:val="1"/>
+    <w:semiHidden/>
     <w:unhideWhenUsed/>
   </w:style>
   <w:style w:type="table" w:default="1" w:styleId="TableNormal">

</xml_diff>